<commit_message>
update cv, about, service and teaching
</commit_message>
<xml_diff>
--- a/files/KeLi_Resume.docx
+++ b/files/KeLi_Resume.docx
@@ -149,7 +149,8 @@
         <w:gridCol w:w="2818"/>
         <w:gridCol w:w="142"/>
         <w:gridCol w:w="142"/>
-        <w:gridCol w:w="425"/>
+        <w:gridCol w:w="283"/>
+        <w:gridCol w:w="142"/>
         <w:gridCol w:w="142"/>
         <w:gridCol w:w="1701"/>
       </w:tblGrid>
@@ -160,7 +161,7 @@
         <w:tc>
           <w:tcPr>
             <w:tcW w:w="10740" w:type="dxa"/>
-            <w:gridSpan w:val="7"/>
+            <w:gridSpan w:val="8"/>
             <w:tcBorders>
               <w:bottom w:val="single" w:sz="4" w:space="0" w:color="auto"/>
             </w:tcBorders>
@@ -229,7 +230,7 @@
         <w:tc>
           <w:tcPr>
             <w:tcW w:w="5370" w:type="dxa"/>
-            <w:gridSpan w:val="6"/>
+            <w:gridSpan w:val="7"/>
           </w:tcPr>
           <w:p>
             <w:pPr>
@@ -347,7 +348,7 @@
         <w:tc>
           <w:tcPr>
             <w:tcW w:w="10740" w:type="dxa"/>
-            <w:gridSpan w:val="7"/>
+            <w:gridSpan w:val="8"/>
           </w:tcPr>
           <w:p>
             <w:pPr>
@@ -510,7 +511,7 @@
         <w:tc>
           <w:tcPr>
             <w:tcW w:w="10740" w:type="dxa"/>
-            <w:gridSpan w:val="7"/>
+            <w:gridSpan w:val="8"/>
           </w:tcPr>
           <w:p>
             <w:pPr>
@@ -697,7 +698,7 @@
         <w:tc>
           <w:tcPr>
             <w:tcW w:w="5370" w:type="dxa"/>
-            <w:gridSpan w:val="6"/>
+            <w:gridSpan w:val="7"/>
           </w:tcPr>
           <w:p>
             <w:pPr>
@@ -767,7 +768,7 @@
         <w:tc>
           <w:tcPr>
             <w:tcW w:w="10740" w:type="dxa"/>
-            <w:gridSpan w:val="7"/>
+            <w:gridSpan w:val="8"/>
           </w:tcPr>
           <w:p>
             <w:pPr>
@@ -860,7 +861,7 @@
         <w:tc>
           <w:tcPr>
             <w:tcW w:w="5370" w:type="dxa"/>
-            <w:gridSpan w:val="6"/>
+            <w:gridSpan w:val="7"/>
           </w:tcPr>
           <w:p>
             <w:pPr>
@@ -946,7 +947,7 @@
         <w:tc>
           <w:tcPr>
             <w:tcW w:w="10740" w:type="dxa"/>
-            <w:gridSpan w:val="7"/>
+            <w:gridSpan w:val="8"/>
           </w:tcPr>
           <w:p>
             <w:pPr>
@@ -985,7 +986,7 @@
         <w:tc>
           <w:tcPr>
             <w:tcW w:w="10740" w:type="dxa"/>
-            <w:gridSpan w:val="7"/>
+            <w:gridSpan w:val="8"/>
           </w:tcPr>
           <w:p>
             <w:pPr>
@@ -1163,7 +1164,7 @@
         <w:tc>
           <w:tcPr>
             <w:tcW w:w="10740" w:type="dxa"/>
-            <w:gridSpan w:val="7"/>
+            <w:gridSpan w:val="8"/>
           </w:tcPr>
           <w:p>
             <w:pPr>
@@ -1187,7 +1188,7 @@
         <w:tc>
           <w:tcPr>
             <w:tcW w:w="10740" w:type="dxa"/>
-            <w:gridSpan w:val="7"/>
+            <w:gridSpan w:val="8"/>
             <w:tcBorders>
               <w:bottom w:val="single" w:sz="4" w:space="0" w:color="auto"/>
             </w:tcBorders>
@@ -1239,7 +1240,7 @@
         <w:tc>
           <w:tcPr>
             <w:tcW w:w="9039" w:type="dxa"/>
-            <w:gridSpan w:val="6"/>
+            <w:gridSpan w:val="7"/>
           </w:tcPr>
           <w:p>
             <w:pPr>
@@ -1570,7 +1571,7 @@
         <w:tc>
           <w:tcPr>
             <w:tcW w:w="9039" w:type="dxa"/>
-            <w:gridSpan w:val="6"/>
+            <w:gridSpan w:val="7"/>
           </w:tcPr>
           <w:p>
             <w:pPr>
@@ -1855,7 +1856,7 @@
         <w:tc>
           <w:tcPr>
             <w:tcW w:w="9039" w:type="dxa"/>
-            <w:gridSpan w:val="6"/>
+            <w:gridSpan w:val="7"/>
           </w:tcPr>
           <w:p>
             <w:pPr>
@@ -1999,27 +2000,7 @@
                 <w:sz w:val="22"/>
                 <w:szCs w:val="22"/>
               </w:rPr>
-              <w:t xml:space="preserve"> Nie, </w:t>
-            </w:r>
-            <w:proofErr w:type="spellStart"/>
-            <w:r>
-              <w:rPr>
-                <w:rFonts w:ascii="Times New Roman" w:hAnsi="Times New Roman" w:cs="Times New Roman"/>
-                <w:bCs/>
-                <w:sz w:val="22"/>
-                <w:szCs w:val="22"/>
-              </w:rPr>
-              <w:t>Jinseok</w:t>
-            </w:r>
-            <w:proofErr w:type="spellEnd"/>
-            <w:r>
-              <w:rPr>
-                <w:rFonts w:ascii="Times New Roman" w:hAnsi="Times New Roman" w:cs="Times New Roman"/>
-                <w:bCs/>
-                <w:sz w:val="22"/>
-                <w:szCs w:val="22"/>
-              </w:rPr>
-              <w:t xml:space="preserve"> Oh, </w:t>
+              <w:t xml:space="preserve"> Nie, Jinseok Oh, </w:t>
             </w:r>
             <w:r>
               <w:rPr>
@@ -2201,7 +2182,7 @@
         <w:tc>
           <w:tcPr>
             <w:tcW w:w="9039" w:type="dxa"/>
-            <w:gridSpan w:val="6"/>
+            <w:gridSpan w:val="7"/>
           </w:tcPr>
           <w:p>
             <w:pPr>
@@ -2406,7 +2387,7 @@
         <w:tc>
           <w:tcPr>
             <w:tcW w:w="9039" w:type="dxa"/>
-            <w:gridSpan w:val="6"/>
+            <w:gridSpan w:val="7"/>
           </w:tcPr>
           <w:p>
             <w:pPr>
@@ -2560,7 +2541,7 @@
         <w:tc>
           <w:tcPr>
             <w:tcW w:w="9039" w:type="dxa"/>
-            <w:gridSpan w:val="6"/>
+            <w:gridSpan w:val="7"/>
           </w:tcPr>
           <w:p>
             <w:pPr>
@@ -2892,7 +2873,7 @@
         <w:tc>
           <w:tcPr>
             <w:tcW w:w="9039" w:type="dxa"/>
-            <w:gridSpan w:val="6"/>
+            <w:gridSpan w:val="7"/>
           </w:tcPr>
           <w:p>
             <w:pPr>
@@ -3136,7 +3117,7 @@
         <w:tc>
           <w:tcPr>
             <w:tcW w:w="9039" w:type="dxa"/>
-            <w:gridSpan w:val="6"/>
+            <w:gridSpan w:val="7"/>
           </w:tcPr>
           <w:p>
             <w:pPr>
@@ -3434,7 +3415,7 @@
         <w:tc>
           <w:tcPr>
             <w:tcW w:w="9039" w:type="dxa"/>
-            <w:gridSpan w:val="6"/>
+            <w:gridSpan w:val="7"/>
           </w:tcPr>
           <w:p>
             <w:pPr>
@@ -3451,7 +3432,6 @@
               </w:rPr>
             </w:pPr>
             <w:hyperlink r:id="rId21" w:history="1">
-              <w:proofErr w:type="spellStart"/>
               <w:r>
                 <w:rPr>
                   <w:rStyle w:val="Hyperlink"/>
@@ -3460,18 +3440,7 @@
                   <w:bCs/>
                   <w:sz w:val="22"/>
                 </w:rPr>
-                <w:t>HPSpeech</w:t>
-              </w:r>
-              <w:proofErr w:type="spellEnd"/>
-              <w:r>
-                <w:rPr>
-                  <w:rStyle w:val="Hyperlink"/>
-                  <w:rFonts w:ascii="Times New Roman" w:hAnsi="Times New Roman" w:cs="Times New Roman"/>
-                  <w:b/>
-                  <w:bCs/>
-                  <w:sz w:val="22"/>
-                </w:rPr>
-                <w:t>: Silent Speech Interface for Commodity Headphones</w:t>
+                <w:t>HPSpeech: Silent Speech Interface for Commodity Headphones</w:t>
               </w:r>
             </w:hyperlink>
             <w:r>
@@ -3641,7 +3610,7 @@
         <w:tc>
           <w:tcPr>
             <w:tcW w:w="9039" w:type="dxa"/>
-            <w:gridSpan w:val="6"/>
+            <w:gridSpan w:val="7"/>
           </w:tcPr>
           <w:p>
             <w:pPr>
@@ -3878,7 +3847,7 @@
         <w:tc>
           <w:tcPr>
             <w:tcW w:w="9039" w:type="dxa"/>
-            <w:gridSpan w:val="6"/>
+            <w:gridSpan w:val="7"/>
           </w:tcPr>
           <w:p>
             <w:pPr>
@@ -4140,7 +4109,7 @@
         <w:tc>
           <w:tcPr>
             <w:tcW w:w="9039" w:type="dxa"/>
-            <w:gridSpan w:val="6"/>
+            <w:gridSpan w:val="7"/>
           </w:tcPr>
           <w:p>
             <w:pPr>
@@ -4440,7 +4409,7 @@
         <w:tc>
           <w:tcPr>
             <w:tcW w:w="9039" w:type="dxa"/>
-            <w:gridSpan w:val="6"/>
+            <w:gridSpan w:val="7"/>
           </w:tcPr>
           <w:p>
             <w:pPr>
@@ -4719,7 +4688,7 @@
         <w:tc>
           <w:tcPr>
             <w:tcW w:w="9039" w:type="dxa"/>
-            <w:gridSpan w:val="6"/>
+            <w:gridSpan w:val="7"/>
           </w:tcPr>
           <w:p>
             <w:pPr>
@@ -5054,7 +5023,7 @@
         <w:tc>
           <w:tcPr>
             <w:tcW w:w="9039" w:type="dxa"/>
-            <w:gridSpan w:val="6"/>
+            <w:gridSpan w:val="7"/>
           </w:tcPr>
           <w:p>
             <w:pPr>
@@ -5299,7 +5268,7 @@
         <w:tc>
           <w:tcPr>
             <w:tcW w:w="9039" w:type="dxa"/>
-            <w:gridSpan w:val="6"/>
+            <w:gridSpan w:val="7"/>
           </w:tcPr>
           <w:p>
             <w:pPr>
@@ -5516,7 +5485,7 @@
         <w:tc>
           <w:tcPr>
             <w:tcW w:w="9039" w:type="dxa"/>
-            <w:gridSpan w:val="6"/>
+            <w:gridSpan w:val="7"/>
           </w:tcPr>
           <w:p>
             <w:pPr>
@@ -5727,8 +5696,9 @@
                 <w:sz w:val="22"/>
                 <w:szCs w:val="22"/>
               </w:rPr>
-              <w:t>Under</w:t>
-            </w:r>
+              <w:t xml:space="preserve">Accepted for publication at </w:t>
+            </w:r>
+            <w:proofErr w:type="spellStart"/>
             <w:r>
               <w:rPr>
                 <w:i/>
@@ -5736,6 +5706,16 @@
                 <w:sz w:val="22"/>
                 <w:szCs w:val="22"/>
               </w:rPr>
+              <w:t>PerCom</w:t>
+            </w:r>
+            <w:proofErr w:type="spellEnd"/>
+            <w:r>
+              <w:rPr>
+                <w:i/>
+                <w:iCs/>
+                <w:sz w:val="22"/>
+                <w:szCs w:val="22"/>
+              </w:rPr>
               <w:t xml:space="preserve"> </w:t>
             </w:r>
             <w:r>
@@ -5745,7 +5725,7 @@
                 <w:sz w:val="22"/>
                 <w:szCs w:val="22"/>
               </w:rPr>
-              <w:t>Review</w:t>
+              <w:t>'</w:t>
             </w:r>
             <w:r>
               <w:rPr>
@@ -5754,6 +5734,15 @@
                 <w:sz w:val="22"/>
                 <w:szCs w:val="22"/>
               </w:rPr>
+              <w:t>26</w:t>
+            </w:r>
+            <w:r>
+              <w:rPr>
+                <w:i/>
+                <w:iCs/>
+                <w:sz w:val="22"/>
+                <w:szCs w:val="22"/>
+              </w:rPr>
               <w:t>)</w:t>
             </w:r>
           </w:p>
@@ -5771,6 +5760,30 @@
                 <w:sz w:val="22"/>
               </w:rPr>
             </w:pPr>
+            <w:r>
+              <w:rPr>
+                <w:rFonts w:ascii="Times New Roman" w:hAnsi="Times New Roman" w:cs="Times New Roman"/>
+                <w:sz w:val="22"/>
+              </w:rPr>
+              <w:t>Pisa, Italy</w:t>
+            </w:r>
+          </w:p>
+          <w:p>
+            <w:pPr>
+              <w:spacing w:line="168" w:lineRule="auto"/>
+              <w:jc w:val="right"/>
+              <w:rPr>
+                <w:rFonts w:ascii="Times New Roman" w:hAnsi="Times New Roman" w:cs="Times New Roman"/>
+                <w:sz w:val="22"/>
+              </w:rPr>
+            </w:pPr>
+            <w:r>
+              <w:rPr>
+                <w:rFonts w:ascii="Times New Roman" w:hAnsi="Times New Roman" w:cs="Times New Roman"/>
+                <w:sz w:val="22"/>
+              </w:rPr>
+              <w:t>Mar. 2026</w:t>
+            </w:r>
           </w:p>
         </w:tc>
       </w:tr>
@@ -5781,7 +5794,7 @@
         <w:tc>
           <w:tcPr>
             <w:tcW w:w="9039" w:type="dxa"/>
-            <w:gridSpan w:val="6"/>
+            <w:gridSpan w:val="7"/>
           </w:tcPr>
           <w:p>
             <w:pPr>
@@ -5822,7 +5835,7 @@
         <w:tc>
           <w:tcPr>
             <w:tcW w:w="9039" w:type="dxa"/>
-            <w:gridSpan w:val="6"/>
+            <w:gridSpan w:val="7"/>
             <w:tcBorders>
               <w:bottom w:val="single" w:sz="4" w:space="0" w:color="auto"/>
             </w:tcBorders>
@@ -5909,14 +5922,14 @@
                 <w:sz w:val="22"/>
                 <w:szCs w:val="22"/>
               </w:rPr>
-              <w:t>Facebook</w:t>
+              <w:t>Meta</w:t>
             </w:r>
           </w:p>
         </w:tc>
         <w:tc>
           <w:tcPr>
             <w:tcW w:w="2268" w:type="dxa"/>
-            <w:gridSpan w:val="3"/>
+            <w:gridSpan w:val="4"/>
             <w:tcBorders>
               <w:top w:val="single" w:sz="4" w:space="0" w:color="auto"/>
             </w:tcBorders>
@@ -6028,7 +6041,7 @@
         <w:tc>
           <w:tcPr>
             <w:tcW w:w="10740" w:type="dxa"/>
-            <w:gridSpan w:val="7"/>
+            <w:gridSpan w:val="8"/>
           </w:tcPr>
           <w:p>
             <w:pPr>
@@ -6167,7 +6180,7 @@
         <w:tc>
           <w:tcPr>
             <w:tcW w:w="2268" w:type="dxa"/>
-            <w:gridSpan w:val="3"/>
+            <w:gridSpan w:val="4"/>
           </w:tcPr>
           <w:p>
             <w:pPr>
@@ -6252,7 +6265,7 @@
         <w:tc>
           <w:tcPr>
             <w:tcW w:w="10740" w:type="dxa"/>
-            <w:gridSpan w:val="7"/>
+            <w:gridSpan w:val="8"/>
           </w:tcPr>
           <w:p>
             <w:pPr>
@@ -6350,7 +6363,7 @@
         <w:tc>
           <w:tcPr>
             <w:tcW w:w="10740" w:type="dxa"/>
-            <w:gridSpan w:val="7"/>
+            <w:gridSpan w:val="8"/>
           </w:tcPr>
           <w:p>
             <w:pPr>
@@ -6371,49 +6384,40 @@
         <w:tc>
           <w:tcPr>
             <w:tcW w:w="10740" w:type="dxa"/>
-            <w:gridSpan w:val="7"/>
+            <w:gridSpan w:val="8"/>
             <w:tcBorders>
               <w:bottom w:val="single" w:sz="4" w:space="0" w:color="auto"/>
             </w:tcBorders>
           </w:tcPr>
           <w:p>
             <w:pPr>
-              <w:spacing w:line="168" w:lineRule="auto"/>
-              <w:jc w:val="left"/>
-              <w:rPr>
-                <w:rFonts w:ascii="Times New Roman" w:hAnsi="Times New Roman" w:cs="Times New Roman"/>
+              <w:pStyle w:val="1"/>
+              <w:spacing w:line="168" w:lineRule="auto"/>
+              <w:ind w:firstLineChars="0" w:firstLine="0"/>
+              <w:rPr>
                 <w:b/>
                 <w:bCs/>
                 <w:sz w:val="22"/>
-              </w:rPr>
-            </w:pPr>
-            <w:r>
-              <w:rPr>
-                <w:rFonts w:ascii="Times New Roman" w:hAnsi="Times New Roman" w:cs="Times New Roman"/>
+                <w:szCs w:val="22"/>
+              </w:rPr>
+            </w:pPr>
+            <w:r>
+              <w:rPr>
                 <w:b/>
                 <w:bCs/>
                 <w:sz w:val="27"/>
                 <w:szCs w:val="27"/>
               </w:rPr>
-              <w:t>S</w:t>
-            </w:r>
-            <w:r>
-              <w:rPr>
-                <w:rFonts w:ascii="Times New Roman" w:hAnsi="Times New Roman" w:cs="Times New Roman"/>
+              <w:t>H</w:t>
+            </w:r>
+            <w:r>
+              <w:rPr>
                 <w:b/>
                 <w:bCs/>
                 <w:sz w:val="22"/>
-              </w:rPr>
-              <w:t>E</w:t>
-            </w:r>
-            <w:r>
-              <w:rPr>
-                <w:rFonts w:ascii="Times New Roman" w:hAnsi="Times New Roman" w:cs="Times New Roman"/>
-                <w:b/>
-                <w:bCs/>
-                <w:sz w:val="22"/>
-              </w:rPr>
-              <w:t>RVICE</w:t>
+                <w:szCs w:val="22"/>
+              </w:rPr>
+              <w:t>ONORS &amp; AWARDS</w:t>
             </w:r>
           </w:p>
         </w:tc>
@@ -6424,204 +6428,51 @@
         </w:trPr>
         <w:tc>
           <w:tcPr>
-            <w:tcW w:w="8188" w:type="dxa"/>
+            <w:tcW w:w="8897" w:type="dxa"/>
+            <w:gridSpan w:val="6"/>
+          </w:tcPr>
+          <w:p>
+            <w:pPr>
+              <w:spacing w:line="168" w:lineRule="auto"/>
+              <w:rPr>
+                <w:rFonts w:ascii="Times New Roman" w:eastAsia="KaiTi" w:hAnsi="Times New Roman" w:cs="Times New Roman"/>
+                <w:iCs/>
+                <w:sz w:val="22"/>
+              </w:rPr>
+            </w:pPr>
+            <w:r>
+              <w:rPr>
+                <w:rFonts w:ascii="Times New Roman" w:hAnsi="Times New Roman" w:cs="Times New Roman"/>
+                <w:b/>
+                <w:sz w:val="22"/>
+                <w:szCs w:val="22"/>
+              </w:rPr>
+              <w:t>Qualcomm Innovation Fellowship 2024</w:t>
+            </w:r>
+          </w:p>
+        </w:tc>
+        <w:tc>
+          <w:tcPr>
+            <w:tcW w:w="1843" w:type="dxa"/>
             <w:gridSpan w:val="2"/>
           </w:tcPr>
           <w:p>
             <w:pPr>
-              <w:tabs>
-                <w:tab w:val="left" w:pos="3624"/>
-              </w:tabs>
-              <w:spacing w:line="168" w:lineRule="auto"/>
-              <w:rPr>
-                <w:rFonts w:ascii="Times New Roman" w:hAnsi="Times New Roman" w:cs="Times New Roman"/>
-                <w:b/>
-                <w:sz w:val="22"/>
-              </w:rPr>
-            </w:pPr>
-            <w:r>
-              <w:rPr>
-                <w:rFonts w:ascii="Times New Roman" w:hAnsi="Times New Roman" w:cs="Times New Roman"/>
-                <w:b/>
-                <w:sz w:val="22"/>
-              </w:rPr>
-              <w:t>External Reviewer</w:t>
-            </w:r>
-          </w:p>
-          <w:p>
-            <w:pPr>
-              <w:pStyle w:val="1"/>
-              <w:spacing w:line="168" w:lineRule="auto"/>
-              <w:ind w:firstLineChars="0" w:firstLine="0"/>
-              <w:jc w:val="both"/>
-            </w:pPr>
-            <w:proofErr w:type="spellStart"/>
-            <w:r>
-              <w:rPr>
-                <w:i/>
-                <w:sz w:val="22"/>
-              </w:rPr>
-              <w:t>UbiComp</w:t>
-            </w:r>
-            <w:proofErr w:type="spellEnd"/>
-            <w:r>
-              <w:rPr>
-                <w:i/>
-                <w:sz w:val="22"/>
-              </w:rPr>
-              <w:t xml:space="preserve"> </w:t>
-            </w:r>
-            <w:r>
-              <w:rPr>
-                <w:i/>
-                <w:iCs/>
-                <w:sz w:val="22"/>
-                <w:szCs w:val="22"/>
-              </w:rPr>
-              <w:t>'</w:t>
-            </w:r>
-            <w:r>
-              <w:rPr>
-                <w:i/>
-                <w:sz w:val="22"/>
-              </w:rPr>
-              <w:t xml:space="preserve">22 </w:t>
-            </w:r>
-            <w:r>
-              <w:rPr>
-                <w:i/>
-                <w:iCs/>
-                <w:sz w:val="22"/>
-                <w:szCs w:val="22"/>
-              </w:rPr>
-              <w:t>'</w:t>
-            </w:r>
-            <w:r>
-              <w:rPr>
-                <w:i/>
-                <w:sz w:val="22"/>
-              </w:rPr>
-              <w:t xml:space="preserve">23 </w:t>
-            </w:r>
-            <w:r>
-              <w:rPr>
-                <w:i/>
-                <w:iCs/>
-                <w:sz w:val="22"/>
-                <w:szCs w:val="22"/>
-              </w:rPr>
-              <w:t>'</w:t>
-            </w:r>
-            <w:r>
-              <w:rPr>
-                <w:i/>
-                <w:sz w:val="22"/>
-              </w:rPr>
-              <w:t xml:space="preserve">24 </w:t>
-            </w:r>
-            <w:r>
-              <w:rPr>
-                <w:i/>
-                <w:iCs/>
-                <w:sz w:val="22"/>
-                <w:szCs w:val="22"/>
-              </w:rPr>
-              <w:t>'</w:t>
-            </w:r>
-            <w:r>
-              <w:rPr>
-                <w:i/>
-                <w:sz w:val="22"/>
-              </w:rPr>
-              <w:t xml:space="preserve">25, UIST </w:t>
-            </w:r>
-            <w:r>
-              <w:rPr>
-                <w:i/>
-                <w:iCs/>
-                <w:sz w:val="22"/>
-                <w:szCs w:val="22"/>
-              </w:rPr>
-              <w:t>'</w:t>
-            </w:r>
-            <w:r>
-              <w:rPr>
-                <w:i/>
-                <w:sz w:val="22"/>
-              </w:rPr>
-              <w:t xml:space="preserve">23, CHI </w:t>
-            </w:r>
-            <w:r>
-              <w:rPr>
-                <w:i/>
-                <w:iCs/>
-                <w:sz w:val="22"/>
-                <w:szCs w:val="22"/>
-              </w:rPr>
-              <w:t>'</w:t>
-            </w:r>
-            <w:r>
-              <w:rPr>
-                <w:i/>
-                <w:sz w:val="22"/>
-              </w:rPr>
-              <w:t xml:space="preserve">24 </w:t>
-            </w:r>
-            <w:r>
-              <w:rPr>
-                <w:i/>
-                <w:iCs/>
-                <w:sz w:val="22"/>
-                <w:szCs w:val="22"/>
-              </w:rPr>
-              <w:t>'</w:t>
-            </w:r>
-            <w:r>
-              <w:rPr>
-                <w:i/>
-                <w:sz w:val="22"/>
-              </w:rPr>
-              <w:t xml:space="preserve">25 </w:t>
-            </w:r>
-            <w:r>
-              <w:rPr>
-                <w:i/>
-                <w:iCs/>
-                <w:sz w:val="22"/>
-                <w:szCs w:val="22"/>
-              </w:rPr>
-              <w:t>'</w:t>
-            </w:r>
-            <w:r>
-              <w:rPr>
-                <w:i/>
-                <w:sz w:val="22"/>
-              </w:rPr>
-              <w:t>26</w:t>
-            </w:r>
-          </w:p>
-        </w:tc>
-        <w:tc>
-          <w:tcPr>
-            <w:tcW w:w="2552" w:type="dxa"/>
-            <w:gridSpan w:val="5"/>
-          </w:tcPr>
-          <w:p>
-            <w:pPr>
               <w:spacing w:line="168" w:lineRule="auto"/>
               <w:jc w:val="right"/>
               <w:rPr>
                 <w:rFonts w:ascii="Times New Roman" w:hAnsi="Times New Roman" w:cs="Times New Roman"/>
                 <w:sz w:val="22"/>
-              </w:rPr>
-            </w:pPr>
-            <w:r>
-              <w:rPr>
-                <w:rFonts w:ascii="Times New Roman" w:hAnsi="Times New Roman" w:cs="Times New Roman"/>
-                <w:sz w:val="22"/>
-                <w:szCs w:val="22"/>
-              </w:rPr>
-              <w:t>2022 - Present</w:t>
+                <w:szCs w:val="22"/>
+              </w:rPr>
+            </w:pPr>
+            <w:r>
+              <w:rPr>
+                <w:rFonts w:ascii="Times New Roman" w:hAnsi="Times New Roman" w:cs="Times New Roman"/>
+                <w:sz w:val="22"/>
+                <w:szCs w:val="22"/>
+              </w:rPr>
+              <w:t>Apr. 2024</w:t>
             </w:r>
           </w:p>
         </w:tc>
@@ -6632,24 +6483,35 @@
         </w:trPr>
         <w:tc>
           <w:tcPr>
-            <w:tcW w:w="9039" w:type="dxa"/>
+            <w:tcW w:w="8897" w:type="dxa"/>
             <w:gridSpan w:val="6"/>
           </w:tcPr>
           <w:p>
             <w:pPr>
-              <w:pStyle w:val="1"/>
-              <w:spacing w:line="168" w:lineRule="auto"/>
-              <w:ind w:firstLineChars="0" w:firstLine="0"/>
-              <w:jc w:val="both"/>
-              <w:rPr>
+              <w:spacing w:line="168" w:lineRule="auto"/>
+              <w:rPr>
+                <w:rFonts w:ascii="Times New Roman" w:hAnsi="Times New Roman" w:cs="Times New Roman"/>
+                <w:b/>
+                <w:sz w:val="22"/>
+              </w:rPr>
+            </w:pPr>
+            <w:r>
+              <w:rPr>
+                <w:rFonts w:ascii="Times New Roman" w:hAnsi="Times New Roman" w:cs="Times New Roman"/>
                 <w:bCs/>
-              </w:rPr>
-            </w:pPr>
-          </w:p>
-        </w:tc>
-        <w:tc>
-          <w:tcPr>
-            <w:tcW w:w="1701" w:type="dxa"/>
+                <w:i/>
+                <w:iCs/>
+                <w:sz w:val="22"/>
+                <w:szCs w:val="22"/>
+              </w:rPr>
+              <w:t>Fellowship focused on recognizing, rewarding, and mentoring PhD students based on Qualcomm’s core values of innovation, execution, and teamwork</w:t>
+            </w:r>
+          </w:p>
+        </w:tc>
+        <w:tc>
+          <w:tcPr>
+            <w:tcW w:w="1843" w:type="dxa"/>
+            <w:gridSpan w:val="2"/>
           </w:tcPr>
           <w:p>
             <w:pPr>
@@ -6658,7 +6520,6 @@
               <w:rPr>
                 <w:rFonts w:ascii="Times New Roman" w:hAnsi="Times New Roman" w:cs="Times New Roman"/>
                 <w:sz w:val="22"/>
-                <w:szCs w:val="22"/>
               </w:rPr>
             </w:pPr>
           </w:p>
@@ -6670,41 +6531,51 @@
         </w:trPr>
         <w:tc>
           <w:tcPr>
-            <w:tcW w:w="10740" w:type="dxa"/>
-            <w:gridSpan w:val="7"/>
-            <w:tcBorders>
-              <w:bottom w:val="single" w:sz="4" w:space="0" w:color="auto"/>
-            </w:tcBorders>
-          </w:tcPr>
-          <w:p>
-            <w:pPr>
-              <w:spacing w:line="168" w:lineRule="auto"/>
-              <w:jc w:val="left"/>
-              <w:rPr>
-                <w:rFonts w:ascii="Times New Roman" w:hAnsi="Times New Roman" w:cs="Times New Roman"/>
-                <w:b/>
-                <w:bCs/>
-                <w:sz w:val="22"/>
-              </w:rPr>
-            </w:pPr>
-            <w:r>
-              <w:rPr>
-                <w:rFonts w:ascii="Times New Roman" w:hAnsi="Times New Roman" w:cs="Times New Roman"/>
-                <w:b/>
-                <w:bCs/>
-                <w:sz w:val="27"/>
-                <w:szCs w:val="27"/>
-              </w:rPr>
-              <w:t>T</w:t>
-            </w:r>
-            <w:r>
-              <w:rPr>
-                <w:rFonts w:ascii="Times New Roman" w:hAnsi="Times New Roman" w:cs="Times New Roman"/>
-                <w:b/>
-                <w:bCs/>
-                <w:sz w:val="22"/>
-              </w:rPr>
-              <w:t>EACHING EXPERIENCES</w:t>
+            <w:tcW w:w="8755" w:type="dxa"/>
+            <w:gridSpan w:val="5"/>
+          </w:tcPr>
+          <w:p>
+            <w:pPr>
+              <w:spacing w:line="168" w:lineRule="auto"/>
+              <w:rPr>
+                <w:rFonts w:ascii="Times New Roman" w:hAnsi="Times New Roman" w:cs="Times New Roman"/>
+                <w:b/>
+                <w:sz w:val="22"/>
+              </w:rPr>
+            </w:pPr>
+            <w:r>
+              <w:rPr>
+                <w:rFonts w:ascii="Times New Roman" w:hAnsi="Times New Roman" w:cs="Times New Roman"/>
+                <w:b/>
+                <w:sz w:val="22"/>
+                <w:szCs w:val="22"/>
+              </w:rPr>
+              <w:t>Nominated for a 2021-2022 Outstanding Teaching Award</w:t>
+            </w:r>
+          </w:p>
+        </w:tc>
+        <w:tc>
+          <w:tcPr>
+            <w:tcW w:w="1985" w:type="dxa"/>
+            <w:gridSpan w:val="3"/>
+          </w:tcPr>
+          <w:p>
+            <w:pPr>
+              <w:spacing w:line="168" w:lineRule="auto"/>
+              <w:jc w:val="right"/>
+              <w:rPr>
+                <w:rFonts w:ascii="Times New Roman" w:hAnsi="Times New Roman" w:cs="Times New Roman"/>
+                <w:sz w:val="22"/>
+                <w:szCs w:val="22"/>
+              </w:rPr>
+            </w:pPr>
+            <w:r>
+              <w:rPr>
+                <w:rFonts w:ascii="Times New Roman" w:hAnsi="Times New Roman" w:cs="Times New Roman"/>
+                <w:sz w:val="22"/>
+                <w:szCs w:val="22"/>
+              </w:rPr>
+              <w:t>May 2022</w:t>
             </w:r>
           </w:p>
         </w:tc>
@@ -6715,130 +6586,56 @@
         </w:trPr>
         <w:tc>
           <w:tcPr>
-            <w:tcW w:w="8188" w:type="dxa"/>
-            <w:gridSpan w:val="2"/>
-          </w:tcPr>
-          <w:p>
-            <w:pPr>
-              <w:tabs>
-                <w:tab w:val="left" w:pos="3624"/>
-              </w:tabs>
-              <w:spacing w:line="168" w:lineRule="auto"/>
-              <w:rPr>
-                <w:rFonts w:ascii="Times New Roman" w:hAnsi="Times New Roman" w:cs="Times New Roman"/>
-                <w:b/>
-                <w:sz w:val="22"/>
-              </w:rPr>
-            </w:pPr>
-            <w:r>
-              <w:rPr>
-                <w:rFonts w:ascii="Times New Roman" w:hAnsi="Times New Roman" w:cs="Times New Roman"/>
-                <w:b/>
-                <w:sz w:val="22"/>
-              </w:rPr>
-              <w:t xml:space="preserve">INFO </w:t>
-            </w:r>
-            <w:r>
-              <w:rPr>
-                <w:rFonts w:ascii="Times New Roman" w:hAnsi="Times New Roman" w:cs="Times New Roman"/>
-                <w:b/>
-                <w:sz w:val="22"/>
-              </w:rPr>
-              <w:t>2951:</w:t>
-            </w:r>
-            <w:r>
-              <w:rPr>
-                <w:rFonts w:ascii="Times New Roman" w:hAnsi="Times New Roman" w:cs="Times New Roman"/>
-                <w:b/>
-                <w:sz w:val="22"/>
-              </w:rPr>
-              <w:t xml:space="preserve"> </w:t>
-            </w:r>
-            <w:r>
-              <w:rPr>
-                <w:rFonts w:ascii="Times New Roman" w:hAnsi="Times New Roman" w:cs="Times New Roman"/>
-                <w:b/>
-                <w:sz w:val="22"/>
-              </w:rPr>
-              <w:t>Introduction to Data Science with R</w:t>
-            </w:r>
-          </w:p>
-          <w:p>
-            <w:pPr>
-              <w:tabs>
-                <w:tab w:val="left" w:pos="3624"/>
-              </w:tabs>
-              <w:spacing w:line="168" w:lineRule="auto"/>
-              <w:rPr>
-                <w:rFonts w:ascii="Times New Roman" w:hAnsi="Times New Roman" w:cs="Times New Roman"/>
-                <w:b/>
-                <w:sz w:val="22"/>
-              </w:rPr>
-            </w:pPr>
-            <w:r>
-              <w:rPr>
-                <w:rFonts w:ascii="Times New Roman" w:hAnsi="Times New Roman" w:cs="Times New Roman"/>
-                <w:i/>
-                <w:sz w:val="22"/>
-              </w:rPr>
-              <w:t xml:space="preserve">Teaching Assistant at Cornell University, Instructor: Prof. </w:t>
-            </w:r>
-            <w:r>
-              <w:rPr>
-                <w:rFonts w:ascii="Times New Roman" w:hAnsi="Times New Roman" w:cs="Times New Roman"/>
-                <w:i/>
-                <w:sz w:val="22"/>
-              </w:rPr>
-              <w:t>Benjamin Soltoff</w:t>
-            </w:r>
-          </w:p>
-        </w:tc>
-        <w:tc>
-          <w:tcPr>
-            <w:tcW w:w="2552" w:type="dxa"/>
+            <w:tcW w:w="8755" w:type="dxa"/>
             <w:gridSpan w:val="5"/>
           </w:tcPr>
           <w:p>
             <w:pPr>
               <w:spacing w:line="168" w:lineRule="auto"/>
+              <w:rPr>
+                <w:rFonts w:ascii="Times New Roman" w:hAnsi="Times New Roman" w:cs="Times New Roman"/>
+                <w:b/>
+                <w:sz w:val="22"/>
+              </w:rPr>
+            </w:pPr>
+            <w:r>
+              <w:rPr>
+                <w:rFonts w:ascii="Times New Roman" w:hAnsi="Times New Roman" w:cs="Times New Roman"/>
+                <w:bCs/>
+                <w:i/>
+                <w:iCs/>
+                <w:sz w:val="22"/>
+                <w:szCs w:val="22"/>
+              </w:rPr>
+              <w:t>Honor bestowed on outstanding PhD teaching assistants in Information Science at Cornel</w:t>
+            </w:r>
+            <w:r>
+              <w:rPr>
+                <w:rFonts w:ascii="Times New Roman" w:hAnsi="Times New Roman" w:cs="Times New Roman"/>
+                <w:bCs/>
+                <w:i/>
+                <w:iCs/>
+                <w:sz w:val="22"/>
+                <w:szCs w:val="22"/>
+              </w:rPr>
+              <w:t>l</w:t>
+            </w:r>
+          </w:p>
+        </w:tc>
+        <w:tc>
+          <w:tcPr>
+            <w:tcW w:w="1985" w:type="dxa"/>
+            <w:gridSpan w:val="3"/>
+          </w:tcPr>
+          <w:p>
+            <w:pPr>
+              <w:spacing w:line="168" w:lineRule="auto"/>
               <w:jc w:val="right"/>
               <w:rPr>
                 <w:rFonts w:ascii="Times New Roman" w:hAnsi="Times New Roman" w:cs="Times New Roman"/>
                 <w:sz w:val="22"/>
               </w:rPr>
             </w:pPr>
-            <w:r>
-              <w:rPr>
-                <w:rFonts w:ascii="Times New Roman" w:hAnsi="Times New Roman" w:cs="Times New Roman"/>
-                <w:sz w:val="22"/>
-                <w:szCs w:val="22"/>
-              </w:rPr>
-              <w:t xml:space="preserve">Spring </w:t>
-            </w:r>
-            <w:r>
-              <w:rPr>
-                <w:rFonts w:ascii="Times New Roman" w:hAnsi="Times New Roman" w:cs="Times New Roman"/>
-                <w:sz w:val="22"/>
-                <w:szCs w:val="22"/>
-              </w:rPr>
-              <w:t>'</w:t>
-            </w:r>
-            <w:r>
-              <w:rPr>
-                <w:rFonts w:ascii="Times New Roman" w:hAnsi="Times New Roman" w:cs="Times New Roman"/>
-                <w:sz w:val="22"/>
-                <w:szCs w:val="22"/>
-              </w:rPr>
-              <w:t>2</w:t>
-            </w:r>
-            <w:r>
-              <w:rPr>
-                <w:rFonts w:ascii="Times New Roman" w:hAnsi="Times New Roman" w:cs="Times New Roman"/>
-                <w:sz w:val="22"/>
-                <w:szCs w:val="22"/>
-              </w:rPr>
-              <w:t>5</w:t>
-            </w:r>
           </w:p>
         </w:tc>
       </w:tr>
@@ -6848,163 +6645,51 @@
         </w:trPr>
         <w:tc>
           <w:tcPr>
-            <w:tcW w:w="8188" w:type="dxa"/>
-            <w:gridSpan w:val="2"/>
-          </w:tcPr>
-          <w:p>
-            <w:pPr>
-              <w:tabs>
-                <w:tab w:val="left" w:pos="3624"/>
-              </w:tabs>
-              <w:spacing w:line="168" w:lineRule="auto"/>
-              <w:rPr>
-                <w:rFonts w:ascii="Times New Roman" w:hAnsi="Times New Roman" w:cs="Times New Roman"/>
-                <w:b/>
-                <w:sz w:val="22"/>
-              </w:rPr>
-            </w:pPr>
-            <w:r>
-              <w:rPr>
-                <w:rFonts w:ascii="Times New Roman" w:hAnsi="Times New Roman" w:cs="Times New Roman"/>
-                <w:b/>
-                <w:sz w:val="22"/>
-              </w:rPr>
-              <w:t xml:space="preserve">INFO </w:t>
-            </w:r>
-            <w:r>
-              <w:rPr>
-                <w:rFonts w:ascii="Times New Roman" w:hAnsi="Times New Roman" w:cs="Times New Roman"/>
-                <w:b/>
-                <w:sz w:val="22"/>
-              </w:rPr>
-              <w:t>4320/5321:</w:t>
-            </w:r>
-            <w:r>
-              <w:rPr>
-                <w:rFonts w:ascii="Times New Roman" w:hAnsi="Times New Roman" w:cs="Times New Roman"/>
-                <w:b/>
-                <w:sz w:val="22"/>
-              </w:rPr>
-              <w:t xml:space="preserve"> </w:t>
-            </w:r>
-            <w:r>
-              <w:rPr>
-                <w:rFonts w:ascii="Times New Roman" w:hAnsi="Times New Roman" w:cs="Times New Roman"/>
-                <w:b/>
-                <w:sz w:val="22"/>
-              </w:rPr>
-              <w:t>Introduction to Rapid Prototyping and Physical Computing</w:t>
-            </w:r>
-          </w:p>
-          <w:p>
-            <w:pPr>
-              <w:pStyle w:val="1"/>
-              <w:spacing w:line="168" w:lineRule="auto"/>
-              <w:ind w:firstLineChars="0" w:firstLine="0"/>
-              <w:jc w:val="both"/>
-            </w:pPr>
-            <w:r>
-              <w:rPr>
-                <w:i/>
-                <w:sz w:val="22"/>
-              </w:rPr>
-              <w:t>Teaching Assistant at Cornell University, Instructor: Prof. Cheng Zhang</w:t>
-            </w:r>
-          </w:p>
-        </w:tc>
-        <w:tc>
-          <w:tcPr>
-            <w:tcW w:w="2552" w:type="dxa"/>
+            <w:tcW w:w="8755" w:type="dxa"/>
             <w:gridSpan w:val="5"/>
           </w:tcPr>
           <w:p>
             <w:pPr>
               <w:spacing w:line="168" w:lineRule="auto"/>
+              <w:rPr>
+                <w:rFonts w:ascii="Times New Roman" w:hAnsi="Times New Roman" w:cs="Times New Roman"/>
+                <w:b/>
+                <w:sz w:val="22"/>
+              </w:rPr>
+            </w:pPr>
+            <w:r>
+              <w:rPr>
+                <w:rFonts w:ascii="Times New Roman" w:hAnsi="Times New Roman" w:cs="Times New Roman"/>
+                <w:b/>
+                <w:sz w:val="22"/>
+                <w:szCs w:val="22"/>
+              </w:rPr>
+              <w:t>Outstanding Graduate in Shanghai (Top 5%)</w:t>
+            </w:r>
+          </w:p>
+        </w:tc>
+        <w:tc>
+          <w:tcPr>
+            <w:tcW w:w="1985" w:type="dxa"/>
+            <w:gridSpan w:val="3"/>
+          </w:tcPr>
+          <w:p>
+            <w:pPr>
+              <w:spacing w:line="168" w:lineRule="auto"/>
               <w:jc w:val="right"/>
               <w:rPr>
                 <w:rFonts w:ascii="Times New Roman" w:hAnsi="Times New Roman" w:cs="Times New Roman"/>
                 <w:sz w:val="22"/>
-              </w:rPr>
-            </w:pPr>
-            <w:r>
-              <w:rPr>
-                <w:rFonts w:ascii="Times New Roman" w:hAnsi="Times New Roman" w:cs="Times New Roman"/>
-                <w:sz w:val="22"/>
-                <w:szCs w:val="22"/>
-              </w:rPr>
-              <w:t xml:space="preserve">Fall </w:t>
-            </w:r>
-            <w:r>
-              <w:rPr>
-                <w:rFonts w:ascii="Times New Roman" w:hAnsi="Times New Roman" w:cs="Times New Roman"/>
-                <w:sz w:val="22"/>
-                <w:szCs w:val="22"/>
-              </w:rPr>
-              <w:t>'</w:t>
-            </w:r>
-            <w:r>
-              <w:rPr>
-                <w:rFonts w:ascii="Times New Roman" w:hAnsi="Times New Roman" w:cs="Times New Roman"/>
-                <w:sz w:val="22"/>
-                <w:szCs w:val="22"/>
-              </w:rPr>
-              <w:t xml:space="preserve">22 </w:t>
-            </w:r>
-            <w:r>
-              <w:rPr>
-                <w:rFonts w:ascii="Times New Roman" w:hAnsi="Times New Roman" w:cs="Times New Roman"/>
-                <w:sz w:val="22"/>
-                <w:szCs w:val="22"/>
-              </w:rPr>
-              <w:t>'</w:t>
-            </w:r>
-            <w:r>
-              <w:rPr>
-                <w:rFonts w:ascii="Times New Roman" w:hAnsi="Times New Roman" w:cs="Times New Roman"/>
-                <w:sz w:val="22"/>
-                <w:szCs w:val="22"/>
-              </w:rPr>
-              <w:t>23,</w:t>
-            </w:r>
-            <w:r>
-              <w:rPr>
-                <w:rFonts w:ascii="Times New Roman" w:hAnsi="Times New Roman" w:cs="Times New Roman"/>
-                <w:sz w:val="22"/>
-                <w:szCs w:val="22"/>
-              </w:rPr>
-              <w:t xml:space="preserve"> </w:t>
-            </w:r>
-            <w:r>
-              <w:rPr>
-                <w:rFonts w:ascii="Times New Roman" w:hAnsi="Times New Roman" w:cs="Times New Roman"/>
-                <w:sz w:val="22"/>
-                <w:szCs w:val="22"/>
-              </w:rPr>
-              <w:t xml:space="preserve">Spring </w:t>
-            </w:r>
-            <w:r>
-              <w:rPr>
-                <w:rFonts w:ascii="Times New Roman" w:hAnsi="Times New Roman" w:cs="Times New Roman"/>
-                <w:sz w:val="22"/>
-                <w:szCs w:val="22"/>
-              </w:rPr>
-              <w:t>'</w:t>
-            </w:r>
-            <w:r>
-              <w:rPr>
-                <w:rFonts w:ascii="Times New Roman" w:hAnsi="Times New Roman" w:cs="Times New Roman"/>
-                <w:sz w:val="22"/>
-                <w:szCs w:val="22"/>
-              </w:rPr>
-              <w:t>2</w:t>
-            </w:r>
-            <w:r>
-              <w:rPr>
-                <w:rFonts w:ascii="Times New Roman" w:hAnsi="Times New Roman" w:cs="Times New Roman"/>
-                <w:sz w:val="22"/>
-                <w:szCs w:val="22"/>
-              </w:rPr>
-              <w:t>3</w:t>
+                <w:szCs w:val="22"/>
+              </w:rPr>
+            </w:pPr>
+            <w:r>
+              <w:rPr>
+                <w:rFonts w:ascii="Times New Roman" w:hAnsi="Times New Roman" w:cs="Times New Roman"/>
+                <w:sz w:val="22"/>
+                <w:szCs w:val="22"/>
+              </w:rPr>
+              <w:t>Jun. 2020</w:t>
             </w:r>
           </w:p>
         </w:tc>
@@ -7015,29 +6700,18 @@
         </w:trPr>
         <w:tc>
           <w:tcPr>
-            <w:tcW w:w="8188" w:type="dxa"/>
-            <w:gridSpan w:val="2"/>
-          </w:tcPr>
-          <w:p>
-            <w:pPr>
-              <w:tabs>
-                <w:tab w:val="left" w:pos="3624"/>
-              </w:tabs>
-              <w:spacing w:line="168" w:lineRule="auto"/>
-              <w:rPr>
-                <w:rFonts w:ascii="Times New Roman" w:hAnsi="Times New Roman" w:cs="Times New Roman"/>
-                <w:b/>
-                <w:sz w:val="22"/>
-              </w:rPr>
-            </w:pPr>
-            <w:r>
-              <w:rPr>
-                <w:rFonts w:ascii="Times New Roman" w:hAnsi="Times New Roman" w:cs="Times New Roman"/>
-                <w:b/>
-                <w:sz w:val="22"/>
-              </w:rPr>
-              <w:t xml:space="preserve">INFO 4120/6120: Ubiquitous Computing </w:t>
-            </w:r>
+            <w:tcW w:w="8755" w:type="dxa"/>
+            <w:gridSpan w:val="5"/>
+          </w:tcPr>
+          <w:p>
+            <w:pPr>
+              <w:spacing w:line="168" w:lineRule="auto"/>
+              <w:rPr>
+                <w:rFonts w:ascii="Times New Roman" w:hAnsi="Times New Roman" w:cs="Times New Roman"/>
+                <w:b/>
+                <w:sz w:val="22"/>
+              </w:rPr>
+            </w:pPr>
             <w:r>
               <w:rPr>
                 <w:rFonts w:ascii="Times New Roman" w:hAnsi="Times New Roman" w:cs="Times New Roman"/>
@@ -7045,36 +6719,16 @@
                 <w:i/>
                 <w:iCs/>
                 <w:sz w:val="22"/>
-              </w:rPr>
-              <w:t>(Nominated for Outstanding Teaching Award)</w:t>
-            </w:r>
-          </w:p>
-          <w:p>
-            <w:pPr>
-              <w:tabs>
-                <w:tab w:val="left" w:pos="3624"/>
-              </w:tabs>
-              <w:spacing w:line="168" w:lineRule="auto"/>
-              <w:rPr>
-                <w:rFonts w:ascii="Times New Roman" w:hAnsi="Times New Roman" w:cs="Times New Roman"/>
-                <w:b/>
-                <w:sz w:val="22"/>
-              </w:rPr>
-            </w:pPr>
-            <w:r>
-              <w:rPr>
-                <w:rFonts w:ascii="Times New Roman" w:hAnsi="Times New Roman" w:cs="Times New Roman"/>
-                <w:i/>
-                <w:sz w:val="22"/>
-              </w:rPr>
-              <w:t>Teaching Assistant at Cornell University, Instructor: Prof. Cheng Zhang</w:t>
-            </w:r>
-          </w:p>
-        </w:tc>
-        <w:tc>
-          <w:tcPr>
-            <w:tcW w:w="2552" w:type="dxa"/>
-            <w:gridSpan w:val="5"/>
+                <w:szCs w:val="22"/>
+              </w:rPr>
+              <w:t>Honor bestowed on outstanding graduates from universities in Shanghai</w:t>
+            </w:r>
+          </w:p>
+        </w:tc>
+        <w:tc>
+          <w:tcPr>
+            <w:tcW w:w="1985" w:type="dxa"/>
+            <w:gridSpan w:val="3"/>
           </w:tcPr>
           <w:p>
             <w:pPr>
@@ -7085,28 +6739,6 @@
                 <w:sz w:val="22"/>
               </w:rPr>
             </w:pPr>
-            <w:r>
-              <w:rPr>
-                <w:rFonts w:ascii="Times New Roman" w:hAnsi="Times New Roman" w:cs="Times New Roman"/>
-                <w:sz w:val="22"/>
-              </w:rPr>
-              <w:t xml:space="preserve">Fall </w:t>
-            </w:r>
-            <w:r>
-              <w:rPr>
-                <w:rFonts w:ascii="Times New Roman" w:hAnsi="Times New Roman" w:cs="Times New Roman"/>
-                <w:sz w:val="22"/>
-                <w:szCs w:val="22"/>
-              </w:rPr>
-              <w:t>'</w:t>
-            </w:r>
-            <w:r>
-              <w:rPr>
-                <w:rFonts w:ascii="Times New Roman" w:hAnsi="Times New Roman" w:cs="Times New Roman"/>
-                <w:sz w:val="22"/>
-              </w:rPr>
-              <w:t>21</w:t>
-            </w:r>
           </w:p>
         </w:tc>
       </w:tr>
@@ -7116,27 +6748,105 @@
         </w:trPr>
         <w:tc>
           <w:tcPr>
-            <w:tcW w:w="8897" w:type="dxa"/>
+            <w:tcW w:w="8755" w:type="dxa"/>
             <w:gridSpan w:val="5"/>
           </w:tcPr>
           <w:p>
             <w:pPr>
-              <w:tabs>
-                <w:tab w:val="left" w:pos="3624"/>
-              </w:tabs>
-              <w:spacing w:line="168" w:lineRule="auto"/>
-              <w:rPr>
-                <w:rFonts w:ascii="Times New Roman" w:hAnsi="Times New Roman" w:cs="Times New Roman"/>
-                <w:b/>
-                <w:sz w:val="22"/>
-              </w:rPr>
-            </w:pPr>
-          </w:p>
-        </w:tc>
-        <w:tc>
-          <w:tcPr>
-            <w:tcW w:w="1843" w:type="dxa"/>
-            <w:gridSpan w:val="2"/>
+              <w:spacing w:line="168" w:lineRule="auto"/>
+              <w:rPr>
+                <w:rFonts w:ascii="Times New Roman" w:hAnsi="Times New Roman" w:cs="Times New Roman"/>
+                <w:b/>
+                <w:sz w:val="22"/>
+              </w:rPr>
+            </w:pPr>
+            <w:r>
+              <w:rPr>
+                <w:rFonts w:ascii="Times New Roman" w:hAnsi="Times New Roman" w:cs="Times New Roman"/>
+                <w:b/>
+                <w:sz w:val="22"/>
+                <w:szCs w:val="22"/>
+              </w:rPr>
+              <w:t xml:space="preserve">A-level </w:t>
+            </w:r>
+            <w:r>
+              <w:rPr>
+                <w:rFonts w:ascii="Times New Roman" w:hAnsi="Times New Roman" w:cs="Times New Roman"/>
+                <w:b/>
+                <w:sz w:val="22"/>
+                <w:szCs w:val="22"/>
+              </w:rPr>
+              <w:t xml:space="preserve">Outstanding </w:t>
+            </w:r>
+            <w:r>
+              <w:rPr>
+                <w:rFonts w:ascii="Times New Roman" w:hAnsi="Times New Roman" w:cs="Times New Roman"/>
+                <w:b/>
+                <w:sz w:val="22"/>
+                <w:szCs w:val="22"/>
+              </w:rPr>
+              <w:t>S</w:t>
+            </w:r>
+            <w:r>
+              <w:rPr>
+                <w:rFonts w:ascii="Times New Roman" w:hAnsi="Times New Roman" w:cs="Times New Roman"/>
+                <w:b/>
+                <w:sz w:val="22"/>
+                <w:szCs w:val="22"/>
+              </w:rPr>
+              <w:t>cholarship of Shanghai Jiao</w:t>
+            </w:r>
+            <w:r>
+              <w:rPr>
+                <w:rFonts w:ascii="Times New Roman" w:hAnsi="Times New Roman" w:cs="Times New Roman"/>
+                <w:b/>
+                <w:sz w:val="22"/>
+                <w:szCs w:val="22"/>
+              </w:rPr>
+              <w:t xml:space="preserve"> T</w:t>
+            </w:r>
+            <w:r>
+              <w:rPr>
+                <w:rFonts w:ascii="Times New Roman" w:hAnsi="Times New Roman" w:cs="Times New Roman"/>
+                <w:b/>
+                <w:sz w:val="22"/>
+                <w:szCs w:val="22"/>
+              </w:rPr>
+              <w:t>ong University</w:t>
+            </w:r>
+            <w:r>
+              <w:rPr>
+                <w:rFonts w:ascii="Times New Roman" w:hAnsi="Times New Roman" w:cs="Times New Roman"/>
+                <w:b/>
+                <w:sz w:val="22"/>
+                <w:szCs w:val="22"/>
+              </w:rPr>
+              <w:t xml:space="preserve"> (Top </w:t>
+            </w:r>
+            <w:r>
+              <w:rPr>
+                <w:rFonts w:ascii="Times New Roman" w:hAnsi="Times New Roman" w:cs="Times New Roman"/>
+                <w:b/>
+                <w:sz w:val="22"/>
+                <w:szCs w:val="22"/>
+              </w:rPr>
+              <w:t>1</w:t>
+            </w:r>
+            <w:r>
+              <w:rPr>
+                <w:rFonts w:ascii="Times New Roman" w:hAnsi="Times New Roman" w:cs="Times New Roman"/>
+                <w:b/>
+                <w:sz w:val="22"/>
+                <w:szCs w:val="22"/>
+              </w:rPr>
+              <w:t>%)</w:t>
+            </w:r>
+          </w:p>
+        </w:tc>
+        <w:tc>
+          <w:tcPr>
+            <w:tcW w:w="1985" w:type="dxa"/>
+            <w:gridSpan w:val="3"/>
           </w:tcPr>
           <w:p>
             <w:pPr>
@@ -7145,8 +6855,25 @@
               <w:rPr>
                 <w:rFonts w:ascii="Times New Roman" w:hAnsi="Times New Roman" w:cs="Times New Roman"/>
                 <w:sz w:val="22"/>
-              </w:rPr>
-            </w:pPr>
+                <w:szCs w:val="22"/>
+              </w:rPr>
+            </w:pPr>
+            <w:r>
+              <w:rPr>
+                <w:rFonts w:ascii="Times New Roman" w:hAnsi="Times New Roman" w:cs="Times New Roman"/>
+                <w:sz w:val="22"/>
+                <w:szCs w:val="22"/>
+              </w:rPr>
+              <w:t>Nov. 201</w:t>
+            </w:r>
+            <w:r>
+              <w:rPr>
+                <w:rFonts w:ascii="Times New Roman" w:hAnsi="Times New Roman" w:cs="Times New Roman"/>
+                <w:sz w:val="22"/>
+                <w:szCs w:val="22"/>
+              </w:rPr>
+              <w:t>9</w:t>
+            </w:r>
           </w:p>
         </w:tc>
       </w:tr>
@@ -7156,57 +6883,52 @@
         </w:trPr>
         <w:tc>
           <w:tcPr>
-            <w:tcW w:w="10740" w:type="dxa"/>
-            <w:gridSpan w:val="7"/>
-            <w:tcBorders>
-              <w:bottom w:val="single" w:sz="4" w:space="0" w:color="auto"/>
-            </w:tcBorders>
-          </w:tcPr>
-          <w:p>
-            <w:pPr>
-              <w:spacing w:line="168" w:lineRule="auto"/>
-              <w:jc w:val="left"/>
-              <w:rPr>
-                <w:rFonts w:ascii="Times New Roman" w:hAnsi="Times New Roman" w:cs="Times New Roman"/>
+            <w:tcW w:w="8755" w:type="dxa"/>
+            <w:gridSpan w:val="5"/>
+          </w:tcPr>
+          <w:p>
+            <w:pPr>
+              <w:spacing w:line="168" w:lineRule="auto"/>
+              <w:rPr>
+                <w:rFonts w:ascii="Times New Roman" w:hAnsi="Times New Roman" w:cs="Times New Roman"/>
+                <w:b/>
                 <w:sz w:val="22"/>
               </w:rPr>
             </w:pPr>
             <w:r>
               <w:rPr>
                 <w:rFonts w:ascii="Times New Roman" w:hAnsi="Times New Roman" w:cs="Times New Roman" w:hint="eastAsia"/>
-                <w:b/>
-                <w:sz w:val="27"/>
-                <w:szCs w:val="27"/>
-              </w:rPr>
-              <w:t>E</w:t>
-            </w:r>
-            <w:r>
-              <w:rPr>
-                <w:rFonts w:ascii="Times New Roman" w:hAnsi="Times New Roman" w:cs="Times New Roman" w:hint="eastAsia"/>
-                <w:b/>
-                <w:sz w:val="22"/>
-                <w:szCs w:val="22"/>
-              </w:rPr>
-              <w:t>XTRACURRICULAR ACTIVIT</w:t>
-            </w:r>
-            <w:r>
-              <w:rPr>
-                <w:rFonts w:ascii="Times New Roman" w:hAnsi="Times New Roman" w:cs="Times New Roman"/>
-                <w:b/>
-                <w:sz w:val="22"/>
-                <w:szCs w:val="22"/>
-              </w:rPr>
-              <w:t>IES</w:t>
-            </w:r>
-            <w:r>
-              <w:rPr>
-                <w:rFonts w:ascii="Times New Roman" w:hAnsi="Times New Roman" w:cs="Times New Roman" w:hint="eastAsia"/>
-                <w:b/>
-                <w:sz w:val="22"/>
-                <w:szCs w:val="22"/>
-              </w:rPr>
-              <w:t xml:space="preserve"> &amp; LEADERSHIP</w:t>
-            </w:r>
+                <w:i/>
+                <w:sz w:val="22"/>
+                <w:szCs w:val="22"/>
+              </w:rPr>
+              <w:t>S</w:t>
+            </w:r>
+            <w:r>
+              <w:rPr>
+                <w:rFonts w:ascii="Times New Roman" w:hAnsi="Times New Roman" w:cs="Times New Roman"/>
+                <w:i/>
+                <w:sz w:val="22"/>
+                <w:szCs w:val="22"/>
+              </w:rPr>
+              <w:t>cholarship awarded to outstanding students at SJTU</w:t>
+            </w:r>
+          </w:p>
+        </w:tc>
+        <w:tc>
+          <w:tcPr>
+            <w:tcW w:w="1985" w:type="dxa"/>
+            <w:gridSpan w:val="3"/>
+          </w:tcPr>
+          <w:p>
+            <w:pPr>
+              <w:spacing w:line="168" w:lineRule="auto"/>
+              <w:jc w:val="right"/>
+              <w:rPr>
+                <w:rFonts w:ascii="Times New Roman" w:hAnsi="Times New Roman" w:cs="Times New Roman"/>
+                <w:sz w:val="22"/>
+              </w:rPr>
+            </w:pPr>
           </w:p>
         </w:tc>
       </w:tr>
@@ -7216,6 +6938,1727 @@
         </w:trPr>
         <w:tc>
           <w:tcPr>
+            <w:tcW w:w="8755" w:type="dxa"/>
+            <w:gridSpan w:val="5"/>
+          </w:tcPr>
+          <w:p>
+            <w:pPr>
+              <w:spacing w:line="168" w:lineRule="auto"/>
+              <w:rPr>
+                <w:rFonts w:ascii="Times New Roman" w:hAnsi="Times New Roman" w:cs="Times New Roman"/>
+                <w:b/>
+                <w:sz w:val="22"/>
+              </w:rPr>
+            </w:pPr>
+            <w:r>
+              <w:rPr>
+                <w:rFonts w:ascii="Times New Roman" w:hAnsi="Times New Roman" w:cs="Times New Roman"/>
+                <w:b/>
+                <w:sz w:val="22"/>
+                <w:szCs w:val="22"/>
+              </w:rPr>
+              <w:t>Tang Lixin Scholarship</w:t>
+            </w:r>
+            <w:r>
+              <w:rPr>
+                <w:rFonts w:ascii="Times New Roman" w:hAnsi="Times New Roman" w:cs="Times New Roman"/>
+                <w:b/>
+                <w:sz w:val="22"/>
+                <w:szCs w:val="22"/>
+              </w:rPr>
+              <w:t xml:space="preserve"> (Top </w:t>
+            </w:r>
+            <w:r>
+              <w:rPr>
+                <w:rFonts w:ascii="Times New Roman" w:hAnsi="Times New Roman" w:cs="Times New Roman"/>
+                <w:b/>
+                <w:sz w:val="22"/>
+                <w:szCs w:val="22"/>
+              </w:rPr>
+              <w:t>0.2</w:t>
+            </w:r>
+            <w:r>
+              <w:rPr>
+                <w:rFonts w:ascii="Times New Roman" w:hAnsi="Times New Roman" w:cs="Times New Roman"/>
+                <w:b/>
+                <w:sz w:val="22"/>
+                <w:szCs w:val="22"/>
+              </w:rPr>
+              <w:t>%)</w:t>
+            </w:r>
+          </w:p>
+        </w:tc>
+        <w:tc>
+          <w:tcPr>
+            <w:tcW w:w="1985" w:type="dxa"/>
+            <w:gridSpan w:val="3"/>
+          </w:tcPr>
+          <w:p>
+            <w:pPr>
+              <w:spacing w:line="168" w:lineRule="auto"/>
+              <w:jc w:val="right"/>
+              <w:rPr>
+                <w:rFonts w:ascii="Times New Roman" w:hAnsi="Times New Roman" w:cs="Times New Roman"/>
+                <w:sz w:val="22"/>
+                <w:szCs w:val="22"/>
+              </w:rPr>
+            </w:pPr>
+            <w:r>
+              <w:rPr>
+                <w:rFonts w:ascii="Times New Roman" w:hAnsi="Times New Roman" w:cs="Times New Roman"/>
+                <w:sz w:val="22"/>
+                <w:szCs w:val="22"/>
+              </w:rPr>
+              <w:t>Oct. 2019</w:t>
+            </w:r>
+          </w:p>
+        </w:tc>
+      </w:tr>
+      <w:tr>
+        <w:trPr>
+          <w:trHeight w:val="20"/>
+        </w:trPr>
+        <w:tc>
+          <w:tcPr>
+            <w:tcW w:w="8755" w:type="dxa"/>
+            <w:gridSpan w:val="5"/>
+          </w:tcPr>
+          <w:p>
+            <w:pPr>
+              <w:spacing w:line="168" w:lineRule="auto"/>
+              <w:rPr>
+                <w:rFonts w:ascii="Times New Roman" w:hAnsi="Times New Roman" w:cs="Times New Roman"/>
+                <w:b/>
+                <w:sz w:val="22"/>
+              </w:rPr>
+            </w:pPr>
+            <w:r>
+              <w:rPr>
+                <w:rFonts w:ascii="Times New Roman" w:hAnsi="Times New Roman" w:cs="Times New Roman"/>
+                <w:i/>
+                <w:sz w:val="22"/>
+                <w:szCs w:val="22"/>
+              </w:rPr>
+              <w:t>Scholarship founded by Mr. Tang Lixin and awarded to Top 60 students at SJTU</w:t>
+            </w:r>
+          </w:p>
+        </w:tc>
+        <w:tc>
+          <w:tcPr>
+            <w:tcW w:w="1985" w:type="dxa"/>
+            <w:gridSpan w:val="3"/>
+          </w:tcPr>
+          <w:p>
+            <w:pPr>
+              <w:spacing w:line="168" w:lineRule="auto"/>
+              <w:jc w:val="right"/>
+              <w:rPr>
+                <w:rFonts w:ascii="Times New Roman" w:hAnsi="Times New Roman" w:cs="Times New Roman"/>
+                <w:sz w:val="22"/>
+              </w:rPr>
+            </w:pPr>
+          </w:p>
+        </w:tc>
+      </w:tr>
+      <w:tr>
+        <w:trPr>
+          <w:trHeight w:val="20"/>
+        </w:trPr>
+        <w:tc>
+          <w:tcPr>
+            <w:tcW w:w="8755" w:type="dxa"/>
+            <w:gridSpan w:val="5"/>
+          </w:tcPr>
+          <w:p>
+            <w:pPr>
+              <w:spacing w:line="168" w:lineRule="auto"/>
+              <w:rPr>
+                <w:rFonts w:ascii="Times New Roman" w:hAnsi="Times New Roman" w:cs="Times New Roman"/>
+                <w:b/>
+                <w:sz w:val="22"/>
+              </w:rPr>
+            </w:pPr>
+            <w:r>
+              <w:rPr>
+                <w:rFonts w:ascii="Times New Roman" w:hAnsi="Times New Roman" w:cs="Times New Roman"/>
+                <w:b/>
+                <w:sz w:val="22"/>
+                <w:szCs w:val="22"/>
+              </w:rPr>
+              <w:t>National Scholarship</w:t>
+            </w:r>
+            <w:r>
+              <w:rPr>
+                <w:rFonts w:ascii="Times New Roman" w:hAnsi="Times New Roman" w:cs="Times New Roman"/>
+                <w:b/>
+                <w:sz w:val="22"/>
+                <w:szCs w:val="22"/>
+              </w:rPr>
+              <w:t xml:space="preserve">*2 </w:t>
+            </w:r>
+            <w:r>
+              <w:rPr>
+                <w:rFonts w:ascii="Times New Roman" w:hAnsi="Times New Roman" w:cs="Times New Roman"/>
+                <w:b/>
+                <w:sz w:val="22"/>
+                <w:szCs w:val="22"/>
+              </w:rPr>
+              <w:t>(</w:t>
+            </w:r>
+            <w:r>
+              <w:rPr>
+                <w:rFonts w:ascii="Times New Roman" w:hAnsi="Times New Roman" w:cs="Times New Roman"/>
+                <w:b/>
+                <w:sz w:val="22"/>
+                <w:szCs w:val="22"/>
+              </w:rPr>
+              <w:t>3</w:t>
+            </w:r>
+            <w:r>
+              <w:rPr>
+                <w:rFonts w:ascii="Times New Roman" w:hAnsi="Times New Roman" w:cs="Times New Roman"/>
+                <w:b/>
+                <w:sz w:val="22"/>
+                <w:szCs w:val="22"/>
+              </w:rPr>
+              <w:t>/</w:t>
+            </w:r>
+            <w:r>
+              <w:rPr>
+                <w:rFonts w:ascii="Times New Roman" w:hAnsi="Times New Roman" w:cs="Times New Roman"/>
+                <w:b/>
+                <w:sz w:val="22"/>
+                <w:szCs w:val="22"/>
+              </w:rPr>
+              <w:t>158, 1/158</w:t>
+            </w:r>
+            <w:r>
+              <w:rPr>
+                <w:rFonts w:ascii="Times New Roman" w:hAnsi="Times New Roman" w:cs="Times New Roman"/>
+                <w:b/>
+                <w:sz w:val="22"/>
+                <w:szCs w:val="22"/>
+              </w:rPr>
+              <w:t>)</w:t>
+            </w:r>
+          </w:p>
+        </w:tc>
+        <w:tc>
+          <w:tcPr>
+            <w:tcW w:w="1985" w:type="dxa"/>
+            <w:gridSpan w:val="3"/>
+          </w:tcPr>
+          <w:p>
+            <w:pPr>
+              <w:spacing w:line="168" w:lineRule="auto"/>
+              <w:jc w:val="right"/>
+              <w:rPr>
+                <w:rFonts w:ascii="Times New Roman" w:hAnsi="Times New Roman" w:cs="Times New Roman"/>
+                <w:sz w:val="22"/>
+                <w:szCs w:val="22"/>
+              </w:rPr>
+            </w:pPr>
+            <w:r>
+              <w:rPr>
+                <w:rFonts w:ascii="Times New Roman" w:hAnsi="Times New Roman" w:cs="Times New Roman"/>
+                <w:sz w:val="22"/>
+                <w:szCs w:val="22"/>
+              </w:rPr>
+              <w:t>Oct. 2018, 2019</w:t>
+            </w:r>
+          </w:p>
+        </w:tc>
+      </w:tr>
+      <w:tr>
+        <w:trPr>
+          <w:trHeight w:val="20"/>
+        </w:trPr>
+        <w:tc>
+          <w:tcPr>
+            <w:tcW w:w="8755" w:type="dxa"/>
+            <w:gridSpan w:val="5"/>
+          </w:tcPr>
+          <w:p>
+            <w:pPr>
+              <w:spacing w:line="168" w:lineRule="auto"/>
+              <w:rPr>
+                <w:rFonts w:ascii="Times New Roman" w:hAnsi="Times New Roman" w:cs="Times New Roman"/>
+                <w:b/>
+                <w:sz w:val="22"/>
+              </w:rPr>
+            </w:pPr>
+            <w:r>
+              <w:rPr>
+                <w:rFonts w:ascii="Times New Roman" w:hAnsi="Times New Roman" w:cs="Times New Roman"/>
+                <w:i/>
+                <w:sz w:val="22"/>
+                <w:szCs w:val="22"/>
+              </w:rPr>
+              <w:t>Top scholarship awarded to undergraduates in China for their achievements in academics</w:t>
+            </w:r>
+          </w:p>
+        </w:tc>
+        <w:tc>
+          <w:tcPr>
+            <w:tcW w:w="1985" w:type="dxa"/>
+            <w:gridSpan w:val="3"/>
+          </w:tcPr>
+          <w:p>
+            <w:pPr>
+              <w:spacing w:line="168" w:lineRule="auto"/>
+              <w:jc w:val="right"/>
+              <w:rPr>
+                <w:rFonts w:ascii="Times New Roman" w:hAnsi="Times New Roman" w:cs="Times New Roman"/>
+                <w:sz w:val="22"/>
+              </w:rPr>
+            </w:pPr>
+          </w:p>
+        </w:tc>
+      </w:tr>
+      <w:tr>
+        <w:trPr>
+          <w:trHeight w:val="20"/>
+        </w:trPr>
+        <w:tc>
+          <w:tcPr>
+            <w:tcW w:w="8755" w:type="dxa"/>
+            <w:gridSpan w:val="5"/>
+          </w:tcPr>
+          <w:p>
+            <w:pPr>
+              <w:spacing w:line="168" w:lineRule="auto"/>
+              <w:rPr>
+                <w:rFonts w:ascii="Times New Roman" w:hAnsi="Times New Roman" w:cs="Times New Roman"/>
+                <w:b/>
+                <w:sz w:val="22"/>
+              </w:rPr>
+            </w:pPr>
+            <w:r>
+              <w:rPr>
+                <w:rFonts w:ascii="Times New Roman" w:hAnsi="Times New Roman" w:cs="Times New Roman"/>
+                <w:b/>
+                <w:sz w:val="22"/>
+                <w:szCs w:val="22"/>
+              </w:rPr>
+              <w:t xml:space="preserve">B-level </w:t>
+            </w:r>
+            <w:r>
+              <w:rPr>
+                <w:rFonts w:ascii="Times New Roman" w:hAnsi="Times New Roman" w:cs="Times New Roman"/>
+                <w:b/>
+                <w:sz w:val="22"/>
+                <w:szCs w:val="22"/>
+              </w:rPr>
+              <w:t xml:space="preserve">Outstanding </w:t>
+            </w:r>
+            <w:r>
+              <w:rPr>
+                <w:rFonts w:ascii="Times New Roman" w:hAnsi="Times New Roman" w:cs="Times New Roman"/>
+                <w:b/>
+                <w:sz w:val="22"/>
+                <w:szCs w:val="22"/>
+              </w:rPr>
+              <w:t>S</w:t>
+            </w:r>
+            <w:r>
+              <w:rPr>
+                <w:rFonts w:ascii="Times New Roman" w:hAnsi="Times New Roman" w:cs="Times New Roman"/>
+                <w:b/>
+                <w:sz w:val="22"/>
+                <w:szCs w:val="22"/>
+              </w:rPr>
+              <w:t>cholarship of Shanghai Jiao</w:t>
+            </w:r>
+            <w:r>
+              <w:rPr>
+                <w:rFonts w:ascii="Times New Roman" w:hAnsi="Times New Roman" w:cs="Times New Roman"/>
+                <w:b/>
+                <w:sz w:val="22"/>
+                <w:szCs w:val="22"/>
+              </w:rPr>
+              <w:t xml:space="preserve"> T</w:t>
+            </w:r>
+            <w:r>
+              <w:rPr>
+                <w:rFonts w:ascii="Times New Roman" w:hAnsi="Times New Roman" w:cs="Times New Roman"/>
+                <w:b/>
+                <w:sz w:val="22"/>
+                <w:szCs w:val="22"/>
+              </w:rPr>
+              <w:t>ong University</w:t>
+            </w:r>
+            <w:r>
+              <w:rPr>
+                <w:rFonts w:ascii="Times New Roman" w:hAnsi="Times New Roman" w:cs="Times New Roman"/>
+                <w:b/>
+                <w:sz w:val="22"/>
+                <w:szCs w:val="22"/>
+              </w:rPr>
+              <w:t>*2</w:t>
+            </w:r>
+            <w:r>
+              <w:rPr>
+                <w:rFonts w:ascii="Times New Roman" w:hAnsi="Times New Roman" w:cs="Times New Roman"/>
+                <w:b/>
+                <w:sz w:val="22"/>
+                <w:szCs w:val="22"/>
+              </w:rPr>
+              <w:t xml:space="preserve"> (Top </w:t>
+            </w:r>
+            <w:r>
+              <w:rPr>
+                <w:rFonts w:ascii="Times New Roman" w:hAnsi="Times New Roman" w:cs="Times New Roman" w:hint="eastAsia"/>
+                <w:b/>
+                <w:sz w:val="22"/>
+                <w:szCs w:val="22"/>
+              </w:rPr>
+              <w:t>5</w:t>
+            </w:r>
+            <w:r>
+              <w:rPr>
+                <w:rFonts w:ascii="Times New Roman" w:hAnsi="Times New Roman" w:cs="Times New Roman"/>
+                <w:b/>
+                <w:sz w:val="22"/>
+                <w:szCs w:val="22"/>
+              </w:rPr>
+              <w:t>%</w:t>
+            </w:r>
+            <w:r>
+              <w:rPr>
+                <w:rFonts w:ascii="Times New Roman" w:hAnsi="Times New Roman" w:cs="Times New Roman"/>
+                <w:b/>
+                <w:sz w:val="22"/>
+                <w:szCs w:val="22"/>
+              </w:rPr>
+              <w:t xml:space="preserve">, Top </w:t>
+            </w:r>
+            <w:r>
+              <w:rPr>
+                <w:rFonts w:ascii="Times New Roman" w:hAnsi="Times New Roman" w:cs="Times New Roman" w:hint="eastAsia"/>
+                <w:b/>
+                <w:sz w:val="22"/>
+                <w:szCs w:val="22"/>
+              </w:rPr>
+              <w:t>2</w:t>
+            </w:r>
+            <w:r>
+              <w:rPr>
+                <w:rFonts w:ascii="Times New Roman" w:hAnsi="Times New Roman" w:cs="Times New Roman"/>
+                <w:b/>
+                <w:sz w:val="22"/>
+                <w:szCs w:val="22"/>
+              </w:rPr>
+              <w:t>%)</w:t>
+            </w:r>
+          </w:p>
+        </w:tc>
+        <w:tc>
+          <w:tcPr>
+            <w:tcW w:w="1985" w:type="dxa"/>
+            <w:gridSpan w:val="3"/>
+          </w:tcPr>
+          <w:p>
+            <w:pPr>
+              <w:spacing w:line="168" w:lineRule="auto"/>
+              <w:jc w:val="right"/>
+              <w:rPr>
+                <w:rFonts w:ascii="Times New Roman" w:hAnsi="Times New Roman" w:cs="Times New Roman"/>
+                <w:sz w:val="22"/>
+                <w:szCs w:val="22"/>
+              </w:rPr>
+            </w:pPr>
+            <w:r>
+              <w:rPr>
+                <w:rFonts w:ascii="Times New Roman" w:hAnsi="Times New Roman" w:cs="Times New Roman"/>
+                <w:sz w:val="22"/>
+                <w:szCs w:val="22"/>
+              </w:rPr>
+              <w:t>Nov</w:t>
+            </w:r>
+            <w:r>
+              <w:rPr>
+                <w:rFonts w:ascii="Times New Roman" w:hAnsi="Times New Roman" w:cs="Times New Roman"/>
+                <w:sz w:val="22"/>
+                <w:szCs w:val="22"/>
+              </w:rPr>
+              <w:t>. 2017</w:t>
+            </w:r>
+            <w:r>
+              <w:rPr>
+                <w:rFonts w:ascii="Times New Roman" w:hAnsi="Times New Roman" w:cs="Times New Roman"/>
+                <w:sz w:val="22"/>
+                <w:szCs w:val="22"/>
+              </w:rPr>
+              <w:t xml:space="preserve">, </w:t>
+            </w:r>
+            <w:proofErr w:type="gramStart"/>
+            <w:r>
+              <w:rPr>
+                <w:rFonts w:ascii="Times New Roman" w:hAnsi="Times New Roman" w:cs="Times New Roman"/>
+                <w:sz w:val="22"/>
+                <w:szCs w:val="22"/>
+              </w:rPr>
+              <w:t>2018</w:t>
+            </w:r>
+            <w:proofErr w:type="gramEnd"/>
+            <w:r>
+              <w:rPr>
+                <w:rFonts w:ascii="Times New Roman" w:hAnsi="Times New Roman" w:cs="Times New Roman"/>
+                <w:sz w:val="22"/>
+                <w:szCs w:val="22"/>
+              </w:rPr>
+              <w:t xml:space="preserve"> </w:t>
+            </w:r>
+            <w:r>
+              <w:rPr>
+                <w:rFonts w:ascii="Times New Roman" w:hAnsi="Times New Roman" w:cs="Times New Roman"/>
+                <w:sz w:val="22"/>
+                <w:szCs w:val="22"/>
+              </w:rPr>
+              <w:t xml:space="preserve"> </w:t>
+            </w:r>
+            <w:r>
+              <w:rPr>
+                <w:rFonts w:ascii="Times New Roman" w:hAnsi="Times New Roman" w:cs="Times New Roman" w:hint="eastAsia"/>
+                <w:sz w:val="22"/>
+                <w:szCs w:val="22"/>
+              </w:rPr>
+              <w:t xml:space="preserve">     </w:t>
+            </w:r>
+          </w:p>
+        </w:tc>
+      </w:tr>
+      <w:tr>
+        <w:trPr>
+          <w:trHeight w:val="20"/>
+        </w:trPr>
+        <w:tc>
+          <w:tcPr>
+            <w:tcW w:w="8755" w:type="dxa"/>
+            <w:gridSpan w:val="5"/>
+          </w:tcPr>
+          <w:p>
+            <w:pPr>
+              <w:spacing w:line="168" w:lineRule="auto"/>
+              <w:rPr>
+                <w:rFonts w:ascii="Times New Roman" w:hAnsi="Times New Roman" w:cs="Times New Roman"/>
+                <w:b/>
+                <w:sz w:val="22"/>
+              </w:rPr>
+            </w:pPr>
+            <w:r>
+              <w:rPr>
+                <w:rFonts w:ascii="Times New Roman" w:hAnsi="Times New Roman" w:cs="Times New Roman" w:hint="eastAsia"/>
+                <w:i/>
+                <w:sz w:val="22"/>
+                <w:szCs w:val="22"/>
+              </w:rPr>
+              <w:t>S</w:t>
+            </w:r>
+            <w:r>
+              <w:rPr>
+                <w:rFonts w:ascii="Times New Roman" w:hAnsi="Times New Roman" w:cs="Times New Roman"/>
+                <w:i/>
+                <w:sz w:val="22"/>
+                <w:szCs w:val="22"/>
+              </w:rPr>
+              <w:t>cholarship awarded to outstanding students at SJTU</w:t>
+            </w:r>
+          </w:p>
+        </w:tc>
+        <w:tc>
+          <w:tcPr>
+            <w:tcW w:w="1985" w:type="dxa"/>
+            <w:gridSpan w:val="3"/>
+          </w:tcPr>
+          <w:p>
+            <w:pPr>
+              <w:spacing w:line="168" w:lineRule="auto"/>
+              <w:jc w:val="right"/>
+              <w:rPr>
+                <w:rFonts w:ascii="Times New Roman" w:hAnsi="Times New Roman" w:cs="Times New Roman"/>
+                <w:sz w:val="22"/>
+              </w:rPr>
+            </w:pPr>
+          </w:p>
+        </w:tc>
+      </w:tr>
+      <w:tr>
+        <w:trPr>
+          <w:trHeight w:val="20"/>
+        </w:trPr>
+        <w:tc>
+          <w:tcPr>
+            <w:tcW w:w="8755" w:type="dxa"/>
+            <w:gridSpan w:val="5"/>
+          </w:tcPr>
+          <w:p>
+            <w:pPr>
+              <w:spacing w:line="168" w:lineRule="auto"/>
+              <w:rPr>
+                <w:rFonts w:ascii="Times New Roman" w:hAnsi="Times New Roman" w:cs="Times New Roman"/>
+                <w:i/>
+                <w:sz w:val="22"/>
+              </w:rPr>
+            </w:pPr>
+            <w:r>
+              <w:rPr>
+                <w:rFonts w:ascii="Times New Roman" w:hAnsi="Times New Roman" w:cs="Times New Roman"/>
+                <w:b/>
+                <w:sz w:val="22"/>
+                <w:szCs w:val="22"/>
+              </w:rPr>
+              <w:t>Wen-Yuan Pan</w:t>
+            </w:r>
+            <w:r>
+              <w:rPr>
+                <w:rFonts w:ascii="Times New Roman" w:hAnsi="Times New Roman" w:cs="Times New Roman"/>
+                <w:b/>
+                <w:sz w:val="22"/>
+                <w:szCs w:val="22"/>
+              </w:rPr>
+              <w:t xml:space="preserve"> Scholarship</w:t>
+            </w:r>
+            <w:r>
+              <w:rPr>
+                <w:rFonts w:ascii="Times New Roman" w:hAnsi="Times New Roman" w:cs="Times New Roman"/>
+                <w:b/>
+                <w:sz w:val="22"/>
+                <w:szCs w:val="22"/>
+              </w:rPr>
+              <w:t xml:space="preserve"> </w:t>
+            </w:r>
+            <w:r>
+              <w:rPr>
+                <w:rFonts w:ascii="Times New Roman" w:hAnsi="Times New Roman" w:cs="Times New Roman"/>
+                <w:b/>
+                <w:sz w:val="22"/>
+                <w:szCs w:val="22"/>
+              </w:rPr>
+              <w:t xml:space="preserve">(Top </w:t>
+            </w:r>
+            <w:r>
+              <w:rPr>
+                <w:rFonts w:ascii="Times New Roman" w:hAnsi="Times New Roman" w:cs="Times New Roman"/>
+                <w:b/>
+                <w:sz w:val="22"/>
+                <w:szCs w:val="22"/>
+              </w:rPr>
+              <w:t>5</w:t>
+            </w:r>
+            <w:r>
+              <w:rPr>
+                <w:rFonts w:ascii="Times New Roman" w:hAnsi="Times New Roman" w:cs="Times New Roman"/>
+                <w:b/>
+                <w:sz w:val="22"/>
+                <w:szCs w:val="22"/>
+              </w:rPr>
+              <w:t>%)</w:t>
+            </w:r>
+          </w:p>
+        </w:tc>
+        <w:tc>
+          <w:tcPr>
+            <w:tcW w:w="1985" w:type="dxa"/>
+            <w:gridSpan w:val="3"/>
+          </w:tcPr>
+          <w:p>
+            <w:pPr>
+              <w:spacing w:line="168" w:lineRule="auto"/>
+              <w:jc w:val="right"/>
+              <w:rPr>
+                <w:rFonts w:ascii="Times New Roman" w:hAnsi="Times New Roman" w:cs="Times New Roman"/>
+                <w:sz w:val="22"/>
+                <w:szCs w:val="22"/>
+              </w:rPr>
+            </w:pPr>
+            <w:r>
+              <w:rPr>
+                <w:rFonts w:ascii="Times New Roman" w:hAnsi="Times New Roman" w:cs="Times New Roman"/>
+                <w:sz w:val="22"/>
+                <w:szCs w:val="22"/>
+              </w:rPr>
+              <w:t>Dec</w:t>
+            </w:r>
+            <w:r>
+              <w:rPr>
+                <w:rFonts w:ascii="Times New Roman" w:hAnsi="Times New Roman" w:cs="Times New Roman"/>
+                <w:sz w:val="22"/>
+                <w:szCs w:val="22"/>
+              </w:rPr>
+              <w:t>. 201</w:t>
+            </w:r>
+            <w:r>
+              <w:rPr>
+                <w:rFonts w:ascii="Times New Roman" w:hAnsi="Times New Roman" w:cs="Times New Roman"/>
+                <w:sz w:val="22"/>
+                <w:szCs w:val="22"/>
+              </w:rPr>
+              <w:t>7</w:t>
+            </w:r>
+          </w:p>
+        </w:tc>
+      </w:tr>
+      <w:tr>
+        <w:trPr>
+          <w:trHeight w:val="20"/>
+        </w:trPr>
+        <w:tc>
+          <w:tcPr>
+            <w:tcW w:w="8755" w:type="dxa"/>
+            <w:gridSpan w:val="5"/>
+          </w:tcPr>
+          <w:p>
+            <w:pPr>
+              <w:spacing w:line="168" w:lineRule="auto"/>
+              <w:rPr>
+                <w:rFonts w:ascii="Times New Roman" w:hAnsi="Times New Roman" w:cs="Times New Roman"/>
+                <w:i/>
+                <w:sz w:val="22"/>
+              </w:rPr>
+            </w:pPr>
+            <w:r>
+              <w:rPr>
+                <w:rFonts w:ascii="Times New Roman" w:hAnsi="Times New Roman" w:cs="Times New Roman"/>
+                <w:i/>
+                <w:sz w:val="22"/>
+                <w:szCs w:val="22"/>
+              </w:rPr>
+              <w:t>Scholarship founded by Wen-Yuan Pan Foundation</w:t>
+            </w:r>
+          </w:p>
+        </w:tc>
+        <w:tc>
+          <w:tcPr>
+            <w:tcW w:w="1985" w:type="dxa"/>
+            <w:gridSpan w:val="3"/>
+          </w:tcPr>
+          <w:p>
+            <w:pPr>
+              <w:spacing w:line="168" w:lineRule="auto"/>
+              <w:jc w:val="right"/>
+              <w:rPr>
+                <w:rFonts w:ascii="Times New Roman" w:hAnsi="Times New Roman" w:cs="Times New Roman"/>
+                <w:sz w:val="22"/>
+              </w:rPr>
+            </w:pPr>
+          </w:p>
+        </w:tc>
+      </w:tr>
+      <w:tr>
+        <w:trPr>
+          <w:trHeight w:val="20"/>
+        </w:trPr>
+        <w:tc>
+          <w:tcPr>
+            <w:tcW w:w="10740" w:type="dxa"/>
+            <w:gridSpan w:val="8"/>
+          </w:tcPr>
+          <w:p>
+            <w:pPr>
+              <w:spacing w:line="168" w:lineRule="auto"/>
+              <w:rPr>
+                <w:rFonts w:ascii="Times New Roman" w:eastAsia="KaiTi" w:hAnsi="Times New Roman" w:cs="Times New Roman"/>
+                <w:i/>
+                <w:sz w:val="22"/>
+              </w:rPr>
+            </w:pPr>
+          </w:p>
+        </w:tc>
+      </w:tr>
+      <w:tr>
+        <w:trPr>
+          <w:trHeight w:val="20"/>
+        </w:trPr>
+        <w:tc>
+          <w:tcPr>
+            <w:tcW w:w="10740" w:type="dxa"/>
+            <w:gridSpan w:val="8"/>
+            <w:tcBorders>
+              <w:bottom w:val="single" w:sz="4" w:space="0" w:color="auto"/>
+            </w:tcBorders>
+          </w:tcPr>
+          <w:p>
+            <w:pPr>
+              <w:spacing w:line="168" w:lineRule="auto"/>
+              <w:jc w:val="left"/>
+              <w:rPr>
+                <w:rFonts w:ascii="Times New Roman" w:hAnsi="Times New Roman" w:cs="Times New Roman"/>
+                <w:b/>
+                <w:bCs/>
+                <w:sz w:val="22"/>
+              </w:rPr>
+            </w:pPr>
+            <w:r>
+              <w:rPr>
+                <w:rFonts w:ascii="Times New Roman" w:hAnsi="Times New Roman" w:cs="Times New Roman"/>
+                <w:b/>
+                <w:bCs/>
+                <w:sz w:val="27"/>
+                <w:szCs w:val="27"/>
+              </w:rPr>
+              <w:t>S</w:t>
+            </w:r>
+            <w:r>
+              <w:rPr>
+                <w:rFonts w:ascii="Times New Roman" w:hAnsi="Times New Roman" w:cs="Times New Roman"/>
+                <w:b/>
+                <w:bCs/>
+                <w:sz w:val="22"/>
+              </w:rPr>
+              <w:t>E</w:t>
+            </w:r>
+            <w:r>
+              <w:rPr>
+                <w:rFonts w:ascii="Times New Roman" w:hAnsi="Times New Roman" w:cs="Times New Roman"/>
+                <w:b/>
+                <w:bCs/>
+                <w:sz w:val="22"/>
+              </w:rPr>
+              <w:t>RVICE</w:t>
+            </w:r>
+          </w:p>
+        </w:tc>
+      </w:tr>
+      <w:tr>
+        <w:trPr>
+          <w:trHeight w:val="20"/>
+        </w:trPr>
+        <w:tc>
+          <w:tcPr>
+            <w:tcW w:w="8188" w:type="dxa"/>
+            <w:gridSpan w:val="2"/>
+          </w:tcPr>
+          <w:p>
+            <w:pPr>
+              <w:tabs>
+                <w:tab w:val="left" w:pos="3624"/>
+              </w:tabs>
+              <w:spacing w:line="168" w:lineRule="auto"/>
+              <w:rPr>
+                <w:rFonts w:ascii="Times New Roman" w:hAnsi="Times New Roman" w:cs="Times New Roman"/>
+                <w:b/>
+                <w:sz w:val="22"/>
+              </w:rPr>
+            </w:pPr>
+            <w:r>
+              <w:rPr>
+                <w:rFonts w:ascii="Times New Roman" w:hAnsi="Times New Roman" w:cs="Times New Roman"/>
+                <w:b/>
+                <w:sz w:val="22"/>
+              </w:rPr>
+              <w:t>External Reviewer</w:t>
+            </w:r>
+          </w:p>
+          <w:p>
+            <w:pPr>
+              <w:pStyle w:val="1"/>
+              <w:spacing w:line="168" w:lineRule="auto"/>
+              <w:ind w:firstLineChars="0" w:firstLine="0"/>
+              <w:jc w:val="both"/>
+            </w:pPr>
+            <w:proofErr w:type="spellStart"/>
+            <w:r>
+              <w:rPr>
+                <w:i/>
+                <w:sz w:val="22"/>
+              </w:rPr>
+              <w:t>UbiComp</w:t>
+            </w:r>
+            <w:proofErr w:type="spellEnd"/>
+            <w:r>
+              <w:rPr>
+                <w:i/>
+                <w:sz w:val="22"/>
+              </w:rPr>
+              <w:t xml:space="preserve"> </w:t>
+            </w:r>
+            <w:r>
+              <w:rPr>
+                <w:i/>
+                <w:iCs/>
+                <w:sz w:val="22"/>
+                <w:szCs w:val="22"/>
+              </w:rPr>
+              <w:t>'</w:t>
+            </w:r>
+            <w:r>
+              <w:rPr>
+                <w:i/>
+                <w:sz w:val="22"/>
+              </w:rPr>
+              <w:t xml:space="preserve">22 </w:t>
+            </w:r>
+            <w:r>
+              <w:rPr>
+                <w:i/>
+                <w:iCs/>
+                <w:sz w:val="22"/>
+                <w:szCs w:val="22"/>
+              </w:rPr>
+              <w:t>'</w:t>
+            </w:r>
+            <w:r>
+              <w:rPr>
+                <w:i/>
+                <w:sz w:val="22"/>
+              </w:rPr>
+              <w:t xml:space="preserve">23 </w:t>
+            </w:r>
+            <w:r>
+              <w:rPr>
+                <w:i/>
+                <w:iCs/>
+                <w:sz w:val="22"/>
+                <w:szCs w:val="22"/>
+              </w:rPr>
+              <w:t>'</w:t>
+            </w:r>
+            <w:r>
+              <w:rPr>
+                <w:i/>
+                <w:sz w:val="22"/>
+              </w:rPr>
+              <w:t xml:space="preserve">24 </w:t>
+            </w:r>
+            <w:r>
+              <w:rPr>
+                <w:i/>
+                <w:iCs/>
+                <w:sz w:val="22"/>
+                <w:szCs w:val="22"/>
+              </w:rPr>
+              <w:t>'</w:t>
+            </w:r>
+            <w:r>
+              <w:rPr>
+                <w:i/>
+                <w:sz w:val="22"/>
+              </w:rPr>
+              <w:t xml:space="preserve">25, UIST </w:t>
+            </w:r>
+            <w:r>
+              <w:rPr>
+                <w:i/>
+                <w:iCs/>
+                <w:sz w:val="22"/>
+                <w:szCs w:val="22"/>
+              </w:rPr>
+              <w:t>'</w:t>
+            </w:r>
+            <w:r>
+              <w:rPr>
+                <w:i/>
+                <w:sz w:val="22"/>
+              </w:rPr>
+              <w:t xml:space="preserve">23, CHI </w:t>
+            </w:r>
+            <w:r>
+              <w:rPr>
+                <w:i/>
+                <w:iCs/>
+                <w:sz w:val="22"/>
+                <w:szCs w:val="22"/>
+              </w:rPr>
+              <w:t>'</w:t>
+            </w:r>
+            <w:r>
+              <w:rPr>
+                <w:i/>
+                <w:sz w:val="22"/>
+              </w:rPr>
+              <w:t xml:space="preserve">24 </w:t>
+            </w:r>
+            <w:r>
+              <w:rPr>
+                <w:i/>
+                <w:iCs/>
+                <w:sz w:val="22"/>
+                <w:szCs w:val="22"/>
+              </w:rPr>
+              <w:t>'</w:t>
+            </w:r>
+            <w:r>
+              <w:rPr>
+                <w:i/>
+                <w:sz w:val="22"/>
+              </w:rPr>
+              <w:t xml:space="preserve">25 </w:t>
+            </w:r>
+            <w:r>
+              <w:rPr>
+                <w:i/>
+                <w:iCs/>
+                <w:sz w:val="22"/>
+                <w:szCs w:val="22"/>
+              </w:rPr>
+              <w:t>'</w:t>
+            </w:r>
+            <w:r>
+              <w:rPr>
+                <w:i/>
+                <w:sz w:val="22"/>
+              </w:rPr>
+              <w:t>26</w:t>
+            </w:r>
+          </w:p>
+        </w:tc>
+        <w:tc>
+          <w:tcPr>
+            <w:tcW w:w="2552" w:type="dxa"/>
+            <w:gridSpan w:val="6"/>
+          </w:tcPr>
+          <w:p>
+            <w:pPr>
+              <w:spacing w:line="168" w:lineRule="auto"/>
+              <w:jc w:val="right"/>
+              <w:rPr>
+                <w:rFonts w:ascii="Times New Roman" w:hAnsi="Times New Roman" w:cs="Times New Roman"/>
+                <w:sz w:val="22"/>
+              </w:rPr>
+            </w:pPr>
+            <w:r>
+              <w:rPr>
+                <w:rFonts w:ascii="Times New Roman" w:hAnsi="Times New Roman" w:cs="Times New Roman"/>
+                <w:sz w:val="22"/>
+                <w:szCs w:val="22"/>
+              </w:rPr>
+              <w:t>2022 - Present</w:t>
+            </w:r>
+          </w:p>
+        </w:tc>
+      </w:tr>
+      <w:tr>
+        <w:trPr>
+          <w:trHeight w:val="20"/>
+        </w:trPr>
+        <w:tc>
+          <w:tcPr>
+            <w:tcW w:w="9039" w:type="dxa"/>
+            <w:gridSpan w:val="7"/>
+          </w:tcPr>
+          <w:p>
+            <w:pPr>
+              <w:pStyle w:val="1"/>
+              <w:spacing w:line="168" w:lineRule="auto"/>
+              <w:ind w:firstLineChars="0" w:firstLine="0"/>
+              <w:jc w:val="both"/>
+              <w:rPr>
+                <w:bCs/>
+              </w:rPr>
+            </w:pPr>
+          </w:p>
+        </w:tc>
+        <w:tc>
+          <w:tcPr>
+            <w:tcW w:w="1701" w:type="dxa"/>
+          </w:tcPr>
+          <w:p>
+            <w:pPr>
+              <w:spacing w:line="168" w:lineRule="auto"/>
+              <w:jc w:val="right"/>
+              <w:rPr>
+                <w:rFonts w:ascii="Times New Roman" w:hAnsi="Times New Roman" w:cs="Times New Roman"/>
+                <w:sz w:val="22"/>
+                <w:szCs w:val="22"/>
+              </w:rPr>
+            </w:pPr>
+          </w:p>
+        </w:tc>
+      </w:tr>
+      <w:tr>
+        <w:trPr>
+          <w:trHeight w:val="20"/>
+        </w:trPr>
+        <w:tc>
+          <w:tcPr>
+            <w:tcW w:w="10740" w:type="dxa"/>
+            <w:gridSpan w:val="8"/>
+            <w:tcBorders>
+              <w:bottom w:val="single" w:sz="4" w:space="0" w:color="auto"/>
+            </w:tcBorders>
+          </w:tcPr>
+          <w:p>
+            <w:pPr>
+              <w:spacing w:line="168" w:lineRule="auto"/>
+              <w:jc w:val="left"/>
+              <w:rPr>
+                <w:rFonts w:ascii="Times New Roman" w:hAnsi="Times New Roman" w:cs="Times New Roman"/>
+                <w:b/>
+                <w:bCs/>
+                <w:sz w:val="22"/>
+              </w:rPr>
+            </w:pPr>
+            <w:r>
+              <w:rPr>
+                <w:rFonts w:ascii="Times New Roman" w:hAnsi="Times New Roman" w:cs="Times New Roman"/>
+                <w:b/>
+                <w:bCs/>
+                <w:sz w:val="27"/>
+                <w:szCs w:val="27"/>
+              </w:rPr>
+              <w:t>T</w:t>
+            </w:r>
+            <w:r>
+              <w:rPr>
+                <w:rFonts w:ascii="Times New Roman" w:hAnsi="Times New Roman" w:cs="Times New Roman"/>
+                <w:b/>
+                <w:bCs/>
+                <w:sz w:val="22"/>
+              </w:rPr>
+              <w:t>EACHING EXPERIENCES</w:t>
+            </w:r>
+          </w:p>
+        </w:tc>
+      </w:tr>
+      <w:tr>
+        <w:trPr>
+          <w:trHeight w:val="20"/>
+        </w:trPr>
+        <w:tc>
+          <w:tcPr>
+            <w:tcW w:w="8188" w:type="dxa"/>
+            <w:gridSpan w:val="2"/>
+          </w:tcPr>
+          <w:p>
+            <w:pPr>
+              <w:tabs>
+                <w:tab w:val="left" w:pos="3624"/>
+              </w:tabs>
+              <w:spacing w:line="168" w:lineRule="auto"/>
+              <w:rPr>
+                <w:rFonts w:ascii="Times New Roman" w:hAnsi="Times New Roman" w:cs="Times New Roman"/>
+                <w:b/>
+                <w:sz w:val="22"/>
+              </w:rPr>
+            </w:pPr>
+            <w:r>
+              <w:rPr>
+                <w:rFonts w:ascii="Times New Roman" w:hAnsi="Times New Roman" w:cs="Times New Roman"/>
+                <w:b/>
+                <w:sz w:val="22"/>
+              </w:rPr>
+              <w:t>INFO</w:t>
+            </w:r>
+            <w:r>
+              <w:rPr>
+                <w:rFonts w:ascii="Times New Roman" w:hAnsi="Times New Roman" w:cs="Times New Roman"/>
+                <w:b/>
+                <w:sz w:val="22"/>
+              </w:rPr>
+              <w:t xml:space="preserve"> </w:t>
+            </w:r>
+            <w:r>
+              <w:rPr>
+                <w:rFonts w:ascii="Times New Roman" w:hAnsi="Times New Roman" w:cs="Times New Roman"/>
+                <w:b/>
+                <w:sz w:val="22"/>
+              </w:rPr>
+              <w:t>4100/5101</w:t>
+            </w:r>
+            <w:r>
+              <w:rPr>
+                <w:rFonts w:ascii="Times New Roman" w:hAnsi="Times New Roman" w:cs="Times New Roman"/>
+                <w:b/>
+                <w:sz w:val="22"/>
+              </w:rPr>
+              <w:t xml:space="preserve">: </w:t>
+            </w:r>
+            <w:r>
+              <w:rPr>
+                <w:rFonts w:ascii="Times New Roman" w:hAnsi="Times New Roman" w:cs="Times New Roman"/>
+                <w:b/>
+                <w:sz w:val="22"/>
+              </w:rPr>
+              <w:t>Learning Analytics</w:t>
+            </w:r>
+          </w:p>
+          <w:p>
+            <w:pPr>
+              <w:tabs>
+                <w:tab w:val="left" w:pos="3624"/>
+              </w:tabs>
+              <w:spacing w:line="168" w:lineRule="auto"/>
+              <w:rPr>
+                <w:rFonts w:ascii="Times New Roman" w:hAnsi="Times New Roman" w:cs="Times New Roman"/>
+                <w:b/>
+                <w:sz w:val="22"/>
+              </w:rPr>
+            </w:pPr>
+            <w:r>
+              <w:rPr>
+                <w:rFonts w:ascii="Times New Roman" w:hAnsi="Times New Roman" w:cs="Times New Roman"/>
+                <w:i/>
+                <w:sz w:val="22"/>
+              </w:rPr>
+              <w:t xml:space="preserve">Teaching Assistant at Cornell University, Instructor: Prof. </w:t>
+            </w:r>
+            <w:r>
+              <w:rPr>
+                <w:rFonts w:ascii="Times New Roman" w:hAnsi="Times New Roman" w:cs="Times New Roman"/>
+                <w:i/>
+                <w:sz w:val="22"/>
+              </w:rPr>
+              <w:t>Rene Kizilcec</w:t>
+            </w:r>
+          </w:p>
+        </w:tc>
+        <w:tc>
+          <w:tcPr>
+            <w:tcW w:w="2552" w:type="dxa"/>
+            <w:gridSpan w:val="6"/>
+          </w:tcPr>
+          <w:p>
+            <w:pPr>
+              <w:spacing w:line="168" w:lineRule="auto"/>
+              <w:jc w:val="right"/>
+              <w:rPr>
+                <w:rFonts w:ascii="Times New Roman" w:hAnsi="Times New Roman" w:cs="Times New Roman"/>
+                <w:sz w:val="22"/>
+              </w:rPr>
+            </w:pPr>
+            <w:r>
+              <w:rPr>
+                <w:rFonts w:ascii="Times New Roman" w:hAnsi="Times New Roman" w:cs="Times New Roman"/>
+                <w:sz w:val="22"/>
+                <w:szCs w:val="22"/>
+              </w:rPr>
+              <w:t xml:space="preserve">Spring </w:t>
+            </w:r>
+            <w:r>
+              <w:rPr>
+                <w:rFonts w:ascii="Times New Roman" w:hAnsi="Times New Roman" w:cs="Times New Roman"/>
+                <w:sz w:val="22"/>
+                <w:szCs w:val="22"/>
+              </w:rPr>
+              <w:t>'</w:t>
+            </w:r>
+            <w:r>
+              <w:rPr>
+                <w:rFonts w:ascii="Times New Roman" w:hAnsi="Times New Roman" w:cs="Times New Roman"/>
+                <w:sz w:val="22"/>
+                <w:szCs w:val="22"/>
+              </w:rPr>
+              <w:t>2</w:t>
+            </w:r>
+            <w:r>
+              <w:rPr>
+                <w:rFonts w:ascii="Times New Roman" w:hAnsi="Times New Roman" w:cs="Times New Roman"/>
+                <w:sz w:val="22"/>
+                <w:szCs w:val="22"/>
+              </w:rPr>
+              <w:t>6</w:t>
+            </w:r>
+          </w:p>
+        </w:tc>
+      </w:tr>
+      <w:tr>
+        <w:trPr>
+          <w:trHeight w:val="20"/>
+        </w:trPr>
+        <w:tc>
+          <w:tcPr>
+            <w:tcW w:w="8188" w:type="dxa"/>
+            <w:gridSpan w:val="2"/>
+          </w:tcPr>
+          <w:p>
+            <w:pPr>
+              <w:tabs>
+                <w:tab w:val="left" w:pos="3624"/>
+              </w:tabs>
+              <w:spacing w:line="168" w:lineRule="auto"/>
+              <w:rPr>
+                <w:rFonts w:ascii="Times New Roman" w:hAnsi="Times New Roman" w:cs="Times New Roman"/>
+                <w:b/>
+                <w:sz w:val="22"/>
+              </w:rPr>
+            </w:pPr>
+            <w:r>
+              <w:rPr>
+                <w:rFonts w:ascii="Times New Roman" w:hAnsi="Times New Roman" w:cs="Times New Roman"/>
+                <w:b/>
+                <w:sz w:val="22"/>
+              </w:rPr>
+              <w:t xml:space="preserve">INFO </w:t>
+            </w:r>
+            <w:r>
+              <w:rPr>
+                <w:rFonts w:ascii="Times New Roman" w:hAnsi="Times New Roman" w:cs="Times New Roman"/>
+                <w:b/>
+                <w:sz w:val="22"/>
+              </w:rPr>
+              <w:t>2951:</w:t>
+            </w:r>
+            <w:r>
+              <w:rPr>
+                <w:rFonts w:ascii="Times New Roman" w:hAnsi="Times New Roman" w:cs="Times New Roman"/>
+                <w:b/>
+                <w:sz w:val="22"/>
+              </w:rPr>
+              <w:t xml:space="preserve"> </w:t>
+            </w:r>
+            <w:r>
+              <w:rPr>
+                <w:rFonts w:ascii="Times New Roman" w:hAnsi="Times New Roman" w:cs="Times New Roman"/>
+                <w:b/>
+                <w:sz w:val="22"/>
+              </w:rPr>
+              <w:t>Introduction to Data Science with R</w:t>
+            </w:r>
+          </w:p>
+          <w:p>
+            <w:pPr>
+              <w:tabs>
+                <w:tab w:val="left" w:pos="3624"/>
+              </w:tabs>
+              <w:spacing w:line="168" w:lineRule="auto"/>
+              <w:rPr>
+                <w:rFonts w:ascii="Times New Roman" w:hAnsi="Times New Roman" w:cs="Times New Roman"/>
+                <w:b/>
+                <w:sz w:val="22"/>
+              </w:rPr>
+            </w:pPr>
+            <w:r>
+              <w:rPr>
+                <w:rFonts w:ascii="Times New Roman" w:hAnsi="Times New Roman" w:cs="Times New Roman"/>
+                <w:i/>
+                <w:sz w:val="22"/>
+              </w:rPr>
+              <w:t xml:space="preserve">Teaching Assistant at Cornell University, Instructor: Prof. </w:t>
+            </w:r>
+            <w:r>
+              <w:rPr>
+                <w:rFonts w:ascii="Times New Roman" w:hAnsi="Times New Roman" w:cs="Times New Roman"/>
+                <w:i/>
+                <w:sz w:val="22"/>
+              </w:rPr>
+              <w:t>Benjamin Soltoff</w:t>
+            </w:r>
+          </w:p>
+        </w:tc>
+        <w:tc>
+          <w:tcPr>
+            <w:tcW w:w="2552" w:type="dxa"/>
+            <w:gridSpan w:val="6"/>
+          </w:tcPr>
+          <w:p>
+            <w:pPr>
+              <w:spacing w:line="168" w:lineRule="auto"/>
+              <w:jc w:val="right"/>
+              <w:rPr>
+                <w:rFonts w:ascii="Times New Roman" w:hAnsi="Times New Roman" w:cs="Times New Roman"/>
+                <w:sz w:val="22"/>
+              </w:rPr>
+            </w:pPr>
+            <w:r>
+              <w:rPr>
+                <w:rFonts w:ascii="Times New Roman" w:hAnsi="Times New Roman" w:cs="Times New Roman"/>
+                <w:sz w:val="22"/>
+                <w:szCs w:val="22"/>
+              </w:rPr>
+              <w:t xml:space="preserve">Spring </w:t>
+            </w:r>
+            <w:r>
+              <w:rPr>
+                <w:rFonts w:ascii="Times New Roman" w:hAnsi="Times New Roman" w:cs="Times New Roman"/>
+                <w:sz w:val="22"/>
+                <w:szCs w:val="22"/>
+              </w:rPr>
+              <w:t>'</w:t>
+            </w:r>
+            <w:r>
+              <w:rPr>
+                <w:rFonts w:ascii="Times New Roman" w:hAnsi="Times New Roman" w:cs="Times New Roman"/>
+                <w:sz w:val="22"/>
+                <w:szCs w:val="22"/>
+              </w:rPr>
+              <w:t>2</w:t>
+            </w:r>
+            <w:r>
+              <w:rPr>
+                <w:rFonts w:ascii="Times New Roman" w:hAnsi="Times New Roman" w:cs="Times New Roman"/>
+                <w:sz w:val="22"/>
+                <w:szCs w:val="22"/>
+              </w:rPr>
+              <w:t>5</w:t>
+            </w:r>
+          </w:p>
+        </w:tc>
+      </w:tr>
+      <w:tr>
+        <w:trPr>
+          <w:trHeight w:val="20"/>
+        </w:trPr>
+        <w:tc>
+          <w:tcPr>
+            <w:tcW w:w="8188" w:type="dxa"/>
+            <w:gridSpan w:val="2"/>
+          </w:tcPr>
+          <w:p>
+            <w:pPr>
+              <w:tabs>
+                <w:tab w:val="left" w:pos="3624"/>
+              </w:tabs>
+              <w:spacing w:line="168" w:lineRule="auto"/>
+              <w:rPr>
+                <w:rFonts w:ascii="Times New Roman" w:hAnsi="Times New Roman" w:cs="Times New Roman"/>
+                <w:b/>
+                <w:sz w:val="22"/>
+              </w:rPr>
+            </w:pPr>
+            <w:r>
+              <w:rPr>
+                <w:rFonts w:ascii="Times New Roman" w:hAnsi="Times New Roman" w:cs="Times New Roman"/>
+                <w:b/>
+                <w:sz w:val="22"/>
+              </w:rPr>
+              <w:t xml:space="preserve">INFO </w:t>
+            </w:r>
+            <w:r>
+              <w:rPr>
+                <w:rFonts w:ascii="Times New Roman" w:hAnsi="Times New Roman" w:cs="Times New Roman"/>
+                <w:b/>
+                <w:sz w:val="22"/>
+              </w:rPr>
+              <w:t>4320/5321:</w:t>
+            </w:r>
+            <w:r>
+              <w:rPr>
+                <w:rFonts w:ascii="Times New Roman" w:hAnsi="Times New Roman" w:cs="Times New Roman"/>
+                <w:b/>
+                <w:sz w:val="22"/>
+              </w:rPr>
+              <w:t xml:space="preserve"> </w:t>
+            </w:r>
+            <w:r>
+              <w:rPr>
+                <w:rFonts w:ascii="Times New Roman" w:hAnsi="Times New Roman" w:cs="Times New Roman"/>
+                <w:b/>
+                <w:sz w:val="22"/>
+              </w:rPr>
+              <w:t>Introduction to Rapid Prototyping and Physical Computing</w:t>
+            </w:r>
+          </w:p>
+          <w:p>
+            <w:pPr>
+              <w:pStyle w:val="1"/>
+              <w:spacing w:line="168" w:lineRule="auto"/>
+              <w:ind w:firstLineChars="0" w:firstLine="0"/>
+              <w:jc w:val="both"/>
+            </w:pPr>
+            <w:r>
+              <w:rPr>
+                <w:i/>
+                <w:sz w:val="22"/>
+              </w:rPr>
+              <w:t>Teaching Assistant at Cornell University, Instructor: Prof. Cheng Zhang</w:t>
+            </w:r>
+          </w:p>
+        </w:tc>
+        <w:tc>
+          <w:tcPr>
+            <w:tcW w:w="2552" w:type="dxa"/>
+            <w:gridSpan w:val="6"/>
+          </w:tcPr>
+          <w:p>
+            <w:pPr>
+              <w:spacing w:line="168" w:lineRule="auto"/>
+              <w:jc w:val="right"/>
+              <w:rPr>
+                <w:rFonts w:ascii="Times New Roman" w:hAnsi="Times New Roman" w:cs="Times New Roman"/>
+                <w:sz w:val="22"/>
+              </w:rPr>
+            </w:pPr>
+            <w:r>
+              <w:rPr>
+                <w:rFonts w:ascii="Times New Roman" w:hAnsi="Times New Roman" w:cs="Times New Roman"/>
+                <w:sz w:val="22"/>
+                <w:szCs w:val="22"/>
+              </w:rPr>
+              <w:t xml:space="preserve">Fall </w:t>
+            </w:r>
+            <w:r>
+              <w:rPr>
+                <w:rFonts w:ascii="Times New Roman" w:hAnsi="Times New Roman" w:cs="Times New Roman"/>
+                <w:sz w:val="22"/>
+                <w:szCs w:val="22"/>
+              </w:rPr>
+              <w:t>'</w:t>
+            </w:r>
+            <w:r>
+              <w:rPr>
+                <w:rFonts w:ascii="Times New Roman" w:hAnsi="Times New Roman" w:cs="Times New Roman"/>
+                <w:sz w:val="22"/>
+                <w:szCs w:val="22"/>
+              </w:rPr>
+              <w:t xml:space="preserve">22 </w:t>
+            </w:r>
+            <w:r>
+              <w:rPr>
+                <w:rFonts w:ascii="Times New Roman" w:hAnsi="Times New Roman" w:cs="Times New Roman"/>
+                <w:sz w:val="22"/>
+                <w:szCs w:val="22"/>
+              </w:rPr>
+              <w:t>'</w:t>
+            </w:r>
+            <w:r>
+              <w:rPr>
+                <w:rFonts w:ascii="Times New Roman" w:hAnsi="Times New Roman" w:cs="Times New Roman"/>
+                <w:sz w:val="22"/>
+                <w:szCs w:val="22"/>
+              </w:rPr>
+              <w:t>23,</w:t>
+            </w:r>
+            <w:r>
+              <w:rPr>
+                <w:rFonts w:ascii="Times New Roman" w:hAnsi="Times New Roman" w:cs="Times New Roman"/>
+                <w:sz w:val="22"/>
+                <w:szCs w:val="22"/>
+              </w:rPr>
+              <w:t xml:space="preserve"> </w:t>
+            </w:r>
+            <w:r>
+              <w:rPr>
+                <w:rFonts w:ascii="Times New Roman" w:hAnsi="Times New Roman" w:cs="Times New Roman"/>
+                <w:sz w:val="22"/>
+                <w:szCs w:val="22"/>
+              </w:rPr>
+              <w:t xml:space="preserve">Spring </w:t>
+            </w:r>
+            <w:r>
+              <w:rPr>
+                <w:rFonts w:ascii="Times New Roman" w:hAnsi="Times New Roman" w:cs="Times New Roman"/>
+                <w:sz w:val="22"/>
+                <w:szCs w:val="22"/>
+              </w:rPr>
+              <w:t>'</w:t>
+            </w:r>
+            <w:r>
+              <w:rPr>
+                <w:rFonts w:ascii="Times New Roman" w:hAnsi="Times New Roman" w:cs="Times New Roman"/>
+                <w:sz w:val="22"/>
+                <w:szCs w:val="22"/>
+              </w:rPr>
+              <w:t>2</w:t>
+            </w:r>
+            <w:r>
+              <w:rPr>
+                <w:rFonts w:ascii="Times New Roman" w:hAnsi="Times New Roman" w:cs="Times New Roman"/>
+                <w:sz w:val="22"/>
+                <w:szCs w:val="22"/>
+              </w:rPr>
+              <w:t>3</w:t>
+            </w:r>
+          </w:p>
+        </w:tc>
+      </w:tr>
+      <w:tr>
+        <w:trPr>
+          <w:trHeight w:val="20"/>
+        </w:trPr>
+        <w:tc>
+          <w:tcPr>
+            <w:tcW w:w="8188" w:type="dxa"/>
+            <w:gridSpan w:val="2"/>
+          </w:tcPr>
+          <w:p>
+            <w:pPr>
+              <w:tabs>
+                <w:tab w:val="left" w:pos="3624"/>
+              </w:tabs>
+              <w:spacing w:line="168" w:lineRule="auto"/>
+              <w:rPr>
+                <w:rFonts w:ascii="Times New Roman" w:hAnsi="Times New Roman" w:cs="Times New Roman"/>
+                <w:b/>
+                <w:sz w:val="22"/>
+              </w:rPr>
+            </w:pPr>
+            <w:r>
+              <w:rPr>
+                <w:rFonts w:ascii="Times New Roman" w:hAnsi="Times New Roman" w:cs="Times New Roman"/>
+                <w:b/>
+                <w:sz w:val="22"/>
+              </w:rPr>
+              <w:t xml:space="preserve">INFO 4120/6120: Ubiquitous Computing </w:t>
+            </w:r>
+            <w:r>
+              <w:rPr>
+                <w:rFonts w:ascii="Times New Roman" w:hAnsi="Times New Roman" w:cs="Times New Roman"/>
+                <w:bCs/>
+                <w:i/>
+                <w:iCs/>
+                <w:sz w:val="22"/>
+              </w:rPr>
+              <w:t>(Nominated for Outstanding Teaching Award)</w:t>
+            </w:r>
+          </w:p>
+          <w:p>
+            <w:pPr>
+              <w:tabs>
+                <w:tab w:val="left" w:pos="3624"/>
+              </w:tabs>
+              <w:spacing w:line="168" w:lineRule="auto"/>
+              <w:rPr>
+                <w:rFonts w:ascii="Times New Roman" w:hAnsi="Times New Roman" w:cs="Times New Roman"/>
+                <w:b/>
+                <w:sz w:val="22"/>
+              </w:rPr>
+            </w:pPr>
+            <w:r>
+              <w:rPr>
+                <w:rFonts w:ascii="Times New Roman" w:hAnsi="Times New Roman" w:cs="Times New Roman"/>
+                <w:i/>
+                <w:sz w:val="22"/>
+              </w:rPr>
+              <w:t>Teaching Assistant at Cornell University, Instructor: Prof. Cheng Zhang</w:t>
+            </w:r>
+          </w:p>
+        </w:tc>
+        <w:tc>
+          <w:tcPr>
+            <w:tcW w:w="2552" w:type="dxa"/>
+            <w:gridSpan w:val="6"/>
+          </w:tcPr>
+          <w:p>
+            <w:pPr>
+              <w:spacing w:line="168" w:lineRule="auto"/>
+              <w:jc w:val="right"/>
+              <w:rPr>
+                <w:rFonts w:ascii="Times New Roman" w:hAnsi="Times New Roman" w:cs="Times New Roman"/>
+                <w:sz w:val="22"/>
+              </w:rPr>
+            </w:pPr>
+            <w:r>
+              <w:rPr>
+                <w:rFonts w:ascii="Times New Roman" w:hAnsi="Times New Roman" w:cs="Times New Roman"/>
+                <w:sz w:val="22"/>
+              </w:rPr>
+              <w:t xml:space="preserve">Fall </w:t>
+            </w:r>
+            <w:r>
+              <w:rPr>
+                <w:rFonts w:ascii="Times New Roman" w:hAnsi="Times New Roman" w:cs="Times New Roman"/>
+                <w:sz w:val="22"/>
+                <w:szCs w:val="22"/>
+              </w:rPr>
+              <w:t>'</w:t>
+            </w:r>
+            <w:r>
+              <w:rPr>
+                <w:rFonts w:ascii="Times New Roman" w:hAnsi="Times New Roman" w:cs="Times New Roman"/>
+                <w:sz w:val="22"/>
+              </w:rPr>
+              <w:t>21</w:t>
+            </w:r>
+          </w:p>
+        </w:tc>
+      </w:tr>
+      <w:tr>
+        <w:trPr>
+          <w:trHeight w:val="20"/>
+        </w:trPr>
+        <w:tc>
+          <w:tcPr>
+            <w:tcW w:w="8897" w:type="dxa"/>
+            <w:gridSpan w:val="6"/>
+          </w:tcPr>
+          <w:p>
+            <w:pPr>
+              <w:tabs>
+                <w:tab w:val="left" w:pos="3624"/>
+              </w:tabs>
+              <w:spacing w:line="168" w:lineRule="auto"/>
+              <w:rPr>
+                <w:rFonts w:ascii="Times New Roman" w:hAnsi="Times New Roman" w:cs="Times New Roman"/>
+                <w:b/>
+                <w:sz w:val="22"/>
+              </w:rPr>
+            </w:pPr>
+          </w:p>
+        </w:tc>
+        <w:tc>
+          <w:tcPr>
+            <w:tcW w:w="1843" w:type="dxa"/>
+            <w:gridSpan w:val="2"/>
+          </w:tcPr>
+          <w:p>
+            <w:pPr>
+              <w:spacing w:line="168" w:lineRule="auto"/>
+              <w:jc w:val="right"/>
+              <w:rPr>
+                <w:rFonts w:ascii="Times New Roman" w:hAnsi="Times New Roman" w:cs="Times New Roman"/>
+                <w:sz w:val="22"/>
+              </w:rPr>
+            </w:pPr>
+          </w:p>
+        </w:tc>
+      </w:tr>
+      <w:tr>
+        <w:trPr>
+          <w:trHeight w:val="20"/>
+        </w:trPr>
+        <w:tc>
+          <w:tcPr>
+            <w:tcW w:w="10740" w:type="dxa"/>
+            <w:gridSpan w:val="8"/>
+            <w:tcBorders>
+              <w:bottom w:val="single" w:sz="4" w:space="0" w:color="auto"/>
+            </w:tcBorders>
+          </w:tcPr>
+          <w:p>
+            <w:pPr>
+              <w:spacing w:line="168" w:lineRule="auto"/>
+              <w:jc w:val="left"/>
+              <w:rPr>
+                <w:rFonts w:ascii="Times New Roman" w:hAnsi="Times New Roman" w:cs="Times New Roman"/>
+                <w:sz w:val="22"/>
+              </w:rPr>
+            </w:pPr>
+            <w:r>
+              <w:rPr>
+                <w:rFonts w:ascii="Times New Roman" w:hAnsi="Times New Roman" w:cs="Times New Roman" w:hint="eastAsia"/>
+                <w:b/>
+                <w:sz w:val="27"/>
+                <w:szCs w:val="27"/>
+              </w:rPr>
+              <w:t>E</w:t>
+            </w:r>
+            <w:r>
+              <w:rPr>
+                <w:rFonts w:ascii="Times New Roman" w:hAnsi="Times New Roman" w:cs="Times New Roman" w:hint="eastAsia"/>
+                <w:b/>
+                <w:sz w:val="22"/>
+                <w:szCs w:val="22"/>
+              </w:rPr>
+              <w:t>XTRACURRICULAR ACTIVIT</w:t>
+            </w:r>
+            <w:r>
+              <w:rPr>
+                <w:rFonts w:ascii="Times New Roman" w:hAnsi="Times New Roman" w:cs="Times New Roman"/>
+                <w:b/>
+                <w:sz w:val="22"/>
+                <w:szCs w:val="22"/>
+              </w:rPr>
+              <w:t>IES</w:t>
+            </w:r>
+            <w:r>
+              <w:rPr>
+                <w:rFonts w:ascii="Times New Roman" w:hAnsi="Times New Roman" w:cs="Times New Roman" w:hint="eastAsia"/>
+                <w:b/>
+                <w:sz w:val="22"/>
+                <w:szCs w:val="22"/>
+              </w:rPr>
+              <w:t xml:space="preserve"> &amp; LEADERSHIP</w:t>
+            </w:r>
+          </w:p>
+        </w:tc>
+      </w:tr>
+      <w:tr>
+        <w:trPr>
+          <w:trHeight w:val="20"/>
+        </w:trPr>
+        <w:tc>
+          <w:tcPr>
             <w:tcW w:w="8472" w:type="dxa"/>
             <w:gridSpan w:val="4"/>
             <w:tcBorders>
@@ -7329,7 +8772,7 @@
         <w:tc>
           <w:tcPr>
             <w:tcW w:w="2268" w:type="dxa"/>
-            <w:gridSpan w:val="3"/>
+            <w:gridSpan w:val="4"/>
             <w:tcBorders>
               <w:top w:val="single" w:sz="4" w:space="0" w:color="auto"/>
             </w:tcBorders>
@@ -7369,7 +8812,7 @@
         <w:tc>
           <w:tcPr>
             <w:tcW w:w="10740" w:type="dxa"/>
-            <w:gridSpan w:val="7"/>
+            <w:gridSpan w:val="8"/>
           </w:tcPr>
           <w:p>
             <w:pPr>
@@ -7476,7 +8919,7 @@
         <w:tc>
           <w:tcPr>
             <w:tcW w:w="2410" w:type="dxa"/>
-            <w:gridSpan w:val="4"/>
+            <w:gridSpan w:val="5"/>
           </w:tcPr>
           <w:p>
             <w:pPr>
@@ -7537,7 +8980,7 @@
         <w:tc>
           <w:tcPr>
             <w:tcW w:w="10740" w:type="dxa"/>
-            <w:gridSpan w:val="7"/>
+            <w:gridSpan w:val="8"/>
           </w:tcPr>
           <w:p>
             <w:pPr>

</xml_diff>

<commit_message>
update pub and about
</commit_message>
<xml_diff>
--- a/files/KeLi_Resume.docx
+++ b/files/KeLi_Resume.docx
@@ -2502,7 +2502,29 @@
                   <w:sz w:val="22"/>
                   <w:szCs w:val="22"/>
                 </w:rPr>
-                <w:t>: Enabling Accurate, Lightweight Self-Touch Sensing with Passive Magnets</w:t>
+                <w:t xml:space="preserve">: Enabling Accurate, Lightweight Self-Touch Sensing </w:t>
+              </w:r>
+              <w:r>
+                <w:rPr>
+                  <w:rStyle w:val="Hyperlink"/>
+                  <w:rFonts w:ascii="Times New Roman" w:hAnsi="Times New Roman" w:cs="Times New Roman"/>
+                  <w:b/>
+                  <w:bCs/>
+                  <w:sz w:val="22"/>
+                  <w:szCs w:val="22"/>
+                </w:rPr>
+                <w:t>w</w:t>
+              </w:r>
+              <w:r>
+                <w:rPr>
+                  <w:rStyle w:val="Hyperlink"/>
+                  <w:rFonts w:ascii="Times New Roman" w:hAnsi="Times New Roman" w:cs="Times New Roman"/>
+                  <w:b/>
+                  <w:bCs/>
+                  <w:sz w:val="22"/>
+                  <w:szCs w:val="22"/>
+                </w:rPr>
+                <w:t>ith Passive Magnets</w:t>
               </w:r>
             </w:hyperlink>
             <w:r>
@@ -2557,7 +2579,23 @@
                 <w:sz w:val="22"/>
                 <w:szCs w:val="22"/>
               </w:rPr>
-              <w:t xml:space="preserve"> Chen. </w:t>
+              <w:t xml:space="preserve"> Chen.</w:t>
+            </w:r>
+            <w:r>
+              <w:rPr>
+                <w:rFonts w:ascii="Times New Roman" w:hAnsi="Times New Roman" w:cs="Times New Roman"/>
+                <w:sz w:val="22"/>
+                <w:szCs w:val="22"/>
+              </w:rPr>
+              <w:t xml:space="preserve"> I</w:t>
+            </w:r>
+            <w:r>
+              <w:rPr>
+                <w:rFonts w:ascii="Times New Roman" w:hAnsi="Times New Roman" w:cs="Times New Roman"/>
+                <w:sz w:val="22"/>
+                <w:szCs w:val="22"/>
+              </w:rPr>
+              <w:t xml:space="preserve">n </w:t>
             </w:r>
             <w:r>
               <w:rPr>
@@ -2567,7 +2605,7 @@
                 <w:sz w:val="22"/>
                 <w:szCs w:val="22"/>
               </w:rPr>
-              <w:t xml:space="preserve">(Accepted for publication at </w:t>
+              <w:t>2026 IEEE International Conference on Pervasive Computing and Communications (</w:t>
             </w:r>
             <w:proofErr w:type="spellStart"/>
             <w:r>
@@ -2589,7 +2627,51 @@
                 <w:sz w:val="22"/>
                 <w:szCs w:val="22"/>
               </w:rPr>
-              <w:t xml:space="preserve"> '26)</w:t>
+              <w:t xml:space="preserve"> </w:t>
+            </w:r>
+            <w:r>
+              <w:rPr>
+                <w:rFonts w:ascii="Times New Roman" w:hAnsi="Times New Roman" w:cs="Times New Roman"/>
+                <w:i/>
+                <w:iCs/>
+                <w:sz w:val="22"/>
+                <w:szCs w:val="22"/>
+              </w:rPr>
+              <w:t>’26</w:t>
+            </w:r>
+            <w:r>
+              <w:rPr>
+                <w:rFonts w:ascii="Times New Roman" w:hAnsi="Times New Roman" w:cs="Times New Roman"/>
+                <w:i/>
+                <w:iCs/>
+                <w:sz w:val="22"/>
+                <w:szCs w:val="22"/>
+              </w:rPr>
+              <w:t>)</w:t>
+            </w:r>
+            <w:r>
+              <w:rPr>
+                <w:rFonts w:ascii="Times New Roman" w:hAnsi="Times New Roman" w:cs="Times New Roman"/>
+                <w:sz w:val="22"/>
+                <w:szCs w:val="22"/>
+              </w:rPr>
+              <w:t xml:space="preserve">, </w:t>
+            </w:r>
+            <w:r>
+              <w:rPr>
+                <w:rFonts w:ascii="Times New Roman" w:hAnsi="Times New Roman" w:cs="Times New Roman"/>
+                <w:sz w:val="22"/>
+                <w:szCs w:val="22"/>
+              </w:rPr>
+              <w:t>pp. 1-10</w:t>
+            </w:r>
+            <w:r>
+              <w:rPr>
+                <w:rFonts w:ascii="Times New Roman" w:hAnsi="Times New Roman" w:cs="Times New Roman"/>
+                <w:sz w:val="22"/>
+                <w:szCs w:val="22"/>
+              </w:rPr>
+              <w:t>.</w:t>
             </w:r>
           </w:p>
         </w:tc>
@@ -3392,7 +3474,7 @@
                 <w:sz w:val="22"/>
                 <w:szCs w:val="22"/>
               </w:rPr>
-              <w:t>Proc. ACM Interact. Mob. Wearable Ubiquitous Technol.</w:t>
+              <w:t xml:space="preserve">Proc. ACM Interact. Mob. Wearable </w:t>
             </w:r>
             <w:r>
               <w:rPr>
@@ -3402,6 +3484,17 @@
                 <w:sz w:val="22"/>
                 <w:szCs w:val="22"/>
               </w:rPr>
+              <w:lastRenderedPageBreak/>
+              <w:t>Ubiquitous Technol.</w:t>
+            </w:r>
+            <w:r>
+              <w:rPr>
+                <w:rFonts w:ascii="Times New Roman" w:hAnsi="Times New Roman" w:cs="Times New Roman"/>
+                <w:i/>
+                <w:iCs/>
+                <w:sz w:val="22"/>
+                <w:szCs w:val="22"/>
+              </w:rPr>
               <w:t xml:space="preserve"> </w:t>
             </w:r>
             <w:r>
@@ -3484,6 +3577,7 @@
                 <w:sz w:val="22"/>
                 <w:szCs w:val="22"/>
               </w:rPr>
+              <w:lastRenderedPageBreak/>
               <w:t>Nov</w:t>
             </w:r>
             <w:r>
@@ -6060,7 +6154,20 @@
                 <w:sz w:val="22"/>
                 <w:szCs w:val="22"/>
               </w:rPr>
-              <w:t>Best Presentation Award</w:t>
+              <w:t xml:space="preserve">Best </w:t>
+            </w:r>
+            <w:r>
+              <w:rPr>
+                <w:rFonts w:ascii="Times New Roman" w:hAnsi="Times New Roman" w:cs="Times New Roman"/>
+                <w:b/>
+                <w:bCs/>
+                <w:i/>
+                <w:iCs/>
+                <w:sz w:val="22"/>
+                <w:szCs w:val="22"/>
+              </w:rPr>
+              <w:lastRenderedPageBreak/>
+              <w:t>Presentation Award</w:t>
             </w:r>
           </w:p>
         </w:tc>
@@ -6084,6 +6191,7 @@
                 <w:sz w:val="22"/>
                 <w:szCs w:val="22"/>
               </w:rPr>
+              <w:lastRenderedPageBreak/>
               <w:t>Nashville,</w:t>
             </w:r>
             <w:r>
@@ -8476,14 +8584,7 @@
                 <w:i/>
                 <w:sz w:val="22"/>
               </w:rPr>
-              <w:t>2</w:t>
-            </w:r>
-            <w:r>
-              <w:rPr>
-                <w:i/>
-                <w:sz w:val="22"/>
-              </w:rPr>
-              <w:t>6</w:t>
+              <w:t>26</w:t>
             </w:r>
             <w:r>
               <w:rPr>
@@ -9000,6 +9101,7 @@
                 <w:i/>
                 <w:sz w:val="22"/>
               </w:rPr>
+              <w:lastRenderedPageBreak/>
               <w:t>Teaching Assistant at Cornell University, Instructor: Prof. Cheng Zhang</w:t>
             </w:r>
           </w:p>
@@ -9024,6 +9126,7 @@
                 <w:sz w:val="22"/>
                 <w:szCs w:val="22"/>
               </w:rPr>
+              <w:lastRenderedPageBreak/>
               <w:t xml:space="preserve">Fall </w:t>
             </w:r>
             <w:r>
@@ -9130,7 +9233,6 @@
                 <w:b/>
                 <w:sz w:val="22"/>
               </w:rPr>
-              <w:lastRenderedPageBreak/>
               <w:t xml:space="preserve">INFO 4120/6120: Ubiquitous Computing </w:t>
             </w:r>
             <w:r>

</xml_diff>